<commit_message>
Documentacion del sprint 3
</commit_message>
<xml_diff>
--- a/Documentacion/04 Evidencias/Evidencias.docx
+++ b/Documentacion/04 Evidencias/Evidencias.docx
@@ -993,11 +993,10 @@
             <w:tabs>
               <w:tab w:val="right" w:leader="dot" w:pos="9350"/>
             </w:tabs>
-            <w:spacing w:after="0"/>
+            <w:spacing w:after="0" w:line="240" w:lineRule="auto"/>
             <w:rPr>
               <w:rFonts w:ascii="Verdana" w:hAnsi="Verdana"/>
               <w:noProof/>
-              <w:color w:val="000000" w:themeColor="text1"/>
               <w:kern w:val="2"/>
               <w:lang w:val="es-EC" w:eastAsia="es-EC"/>
               <w14:ligatures w14:val="standardContextual"/>
@@ -1007,8 +1006,6 @@
             <w:rPr>
               <w:rFonts w:ascii="Verdana" w:hAnsi="Verdana"/>
               <w:color w:val="000000" w:themeColor="text1"/>
-              <w:sz w:val="18"/>
-              <w:szCs w:val="18"/>
               <w:lang w:val="es-419"/>
             </w:rPr>
             <w:fldChar w:fldCharType="begin"/>
@@ -1017,8 +1014,6 @@
             <w:rPr>
               <w:rFonts w:ascii="Verdana" w:hAnsi="Verdana"/>
               <w:color w:val="000000" w:themeColor="text1"/>
-              <w:sz w:val="18"/>
-              <w:szCs w:val="18"/>
               <w:lang w:val="es-419"/>
             </w:rPr>
             <w:instrText xml:space="preserve"> TOC \o "1-3" \h \z \u </w:instrText>
@@ -1027,19 +1022,16 @@
             <w:rPr>
               <w:rFonts w:ascii="Verdana" w:hAnsi="Verdana"/>
               <w:color w:val="000000" w:themeColor="text1"/>
-              <w:sz w:val="18"/>
-              <w:szCs w:val="18"/>
               <w:lang w:val="es-419"/>
             </w:rPr>
             <w:fldChar w:fldCharType="separate"/>
           </w:r>
-          <w:hyperlink w:anchor="_Toc239453337" w:history="1">
+          <w:hyperlink w:anchor="_Toc240279706" w:history="1">
             <w:r>
               <w:rPr>
                 <w:rStyle w:val="Hipervnculo"/>
                 <w:rFonts w:ascii="Verdana" w:hAnsi="Verdana"/>
                 <w:noProof/>
-                <w:color w:val="000000" w:themeColor="text1"/>
                 <w:lang w:val="es-EC"/>
               </w:rPr>
               <w:t>Propósito del documento</w:t>
@@ -1049,7 +1041,6 @@
                 <w:rFonts w:ascii="Verdana" w:hAnsi="Verdana"/>
                 <w:noProof/>
                 <w:webHidden/>
-                <w:color w:val="000000" w:themeColor="text1"/>
               </w:rPr>
               <w:tab/>
             </w:r>
@@ -1058,7 +1049,6 @@
                 <w:rFonts w:ascii="Verdana" w:hAnsi="Verdana"/>
                 <w:noProof/>
                 <w:webHidden/>
-                <w:color w:val="000000" w:themeColor="text1"/>
               </w:rPr>
               <w:fldChar w:fldCharType="begin"/>
             </w:r>
@@ -1067,16 +1057,14 @@
                 <w:rFonts w:ascii="Verdana" w:hAnsi="Verdana"/>
                 <w:noProof/>
                 <w:webHidden/>
-                <w:color w:val="000000" w:themeColor="text1"/>
               </w:rPr>
-              <w:instrText xml:space="preserve"> PAGEREF _Toc239453337 \h </w:instrText>
+              <w:instrText xml:space="preserve"> PAGEREF _Toc240279706 \h </w:instrText>
             </w:r>
             <w:r>
               <w:rPr>
                 <w:rFonts w:ascii="Verdana" w:hAnsi="Verdana"/>
                 <w:noProof/>
                 <w:webHidden/>
-                <w:color w:val="000000" w:themeColor="text1"/>
               </w:rPr>
             </w:r>
             <w:r>
@@ -1084,7 +1072,6 @@
                 <w:rFonts w:ascii="Verdana" w:hAnsi="Verdana"/>
                 <w:noProof/>
                 <w:webHidden/>
-                <w:color w:val="000000" w:themeColor="text1"/>
               </w:rPr>
               <w:fldChar w:fldCharType="separate"/>
             </w:r>
@@ -1093,7 +1080,6 @@
                 <w:rFonts w:ascii="Verdana" w:hAnsi="Verdana"/>
                 <w:noProof/>
                 <w:webHidden/>
-                <w:color w:val="000000" w:themeColor="text1"/>
               </w:rPr>
               <w:t>3</w:t>
             </w:r>
@@ -1102,7 +1088,6 @@
                 <w:rFonts w:ascii="Verdana" w:hAnsi="Verdana"/>
                 <w:noProof/>
                 <w:webHidden/>
-                <w:color w:val="000000" w:themeColor="text1"/>
               </w:rPr>
               <w:fldChar w:fldCharType="end"/>
             </w:r>
@@ -1114,23 +1099,21 @@
             <w:tabs>
               <w:tab w:val="right" w:leader="dot" w:pos="9350"/>
             </w:tabs>
-            <w:spacing w:after="0"/>
+            <w:spacing w:after="0" w:line="240" w:lineRule="auto"/>
             <w:rPr>
               <w:rFonts w:ascii="Verdana" w:hAnsi="Verdana"/>
               <w:noProof/>
-              <w:color w:val="000000" w:themeColor="text1"/>
               <w:kern w:val="2"/>
               <w:lang w:val="es-EC" w:eastAsia="es-EC"/>
               <w14:ligatures w14:val="standardContextual"/>
             </w:rPr>
           </w:pPr>
-          <w:hyperlink w:anchor="_Toc239453338" w:history="1">
+          <w:hyperlink w:anchor="_Toc240279707" w:history="1">
             <w:r>
               <w:rPr>
                 <w:rStyle w:val="Hipervnculo"/>
                 <w:rFonts w:ascii="Verdana" w:hAnsi="Verdana"/>
                 <w:noProof/>
-                <w:color w:val="000000" w:themeColor="text1"/>
               </w:rPr>
               <w:t>EV-01. Reunión de Sprint Planning</w:t>
             </w:r>
@@ -1139,7 +1122,6 @@
                 <w:rFonts w:ascii="Verdana" w:hAnsi="Verdana"/>
                 <w:noProof/>
                 <w:webHidden/>
-                <w:color w:val="000000" w:themeColor="text1"/>
               </w:rPr>
               <w:tab/>
             </w:r>
@@ -1148,7 +1130,6 @@
                 <w:rFonts w:ascii="Verdana" w:hAnsi="Verdana"/>
                 <w:noProof/>
                 <w:webHidden/>
-                <w:color w:val="000000" w:themeColor="text1"/>
               </w:rPr>
               <w:fldChar w:fldCharType="begin"/>
             </w:r>
@@ -1157,16 +1138,14 @@
                 <w:rFonts w:ascii="Verdana" w:hAnsi="Verdana"/>
                 <w:noProof/>
                 <w:webHidden/>
-                <w:color w:val="000000" w:themeColor="text1"/>
               </w:rPr>
-              <w:instrText xml:space="preserve"> PAGEREF _Toc239453338 \h </w:instrText>
+              <w:instrText xml:space="preserve"> PAGEREF _Toc240279707 \h </w:instrText>
             </w:r>
             <w:r>
               <w:rPr>
                 <w:rFonts w:ascii="Verdana" w:hAnsi="Verdana"/>
                 <w:noProof/>
                 <w:webHidden/>
-                <w:color w:val="000000" w:themeColor="text1"/>
               </w:rPr>
             </w:r>
             <w:r>
@@ -1174,7 +1153,6 @@
                 <w:rFonts w:ascii="Verdana" w:hAnsi="Verdana"/>
                 <w:noProof/>
                 <w:webHidden/>
-                <w:color w:val="000000" w:themeColor="text1"/>
               </w:rPr>
               <w:fldChar w:fldCharType="separate"/>
             </w:r>
@@ -1183,7 +1161,6 @@
                 <w:rFonts w:ascii="Verdana" w:hAnsi="Verdana"/>
                 <w:noProof/>
                 <w:webHidden/>
-                <w:color w:val="000000" w:themeColor="text1"/>
               </w:rPr>
               <w:t>3</w:t>
             </w:r>
@@ -1192,7 +1169,6 @@
                 <w:rFonts w:ascii="Verdana" w:hAnsi="Verdana"/>
                 <w:noProof/>
                 <w:webHidden/>
-                <w:color w:val="000000" w:themeColor="text1"/>
               </w:rPr>
               <w:fldChar w:fldCharType="end"/>
             </w:r>
@@ -1204,23 +1180,21 @@
             <w:tabs>
               <w:tab w:val="right" w:leader="dot" w:pos="9350"/>
             </w:tabs>
-            <w:spacing w:after="0"/>
+            <w:spacing w:after="0" w:line="240" w:lineRule="auto"/>
             <w:rPr>
               <w:rFonts w:ascii="Verdana" w:hAnsi="Verdana"/>
               <w:noProof/>
-              <w:color w:val="000000" w:themeColor="text1"/>
               <w:kern w:val="2"/>
               <w:lang w:val="es-EC" w:eastAsia="es-EC"/>
               <w14:ligatures w14:val="standardContextual"/>
             </w:rPr>
           </w:pPr>
-          <w:hyperlink w:anchor="_Toc239453339" w:history="1">
+          <w:hyperlink w:anchor="_Toc240279708" w:history="1">
             <w:r>
               <w:rPr>
                 <w:rStyle w:val="Hipervnculo"/>
                 <w:rFonts w:ascii="Verdana" w:hAnsi="Verdana"/>
                 <w:noProof/>
-                <w:color w:val="000000" w:themeColor="text1"/>
                 <w:lang w:val="es-EC"/>
               </w:rPr>
               <w:t>EV-02. Revisión JIRA y Avances</w:t>
@@ -1230,7 +1204,6 @@
                 <w:rFonts w:ascii="Verdana" w:hAnsi="Verdana"/>
                 <w:noProof/>
                 <w:webHidden/>
-                <w:color w:val="000000" w:themeColor="text1"/>
               </w:rPr>
               <w:tab/>
             </w:r>
@@ -1239,7 +1212,6 @@
                 <w:rFonts w:ascii="Verdana" w:hAnsi="Verdana"/>
                 <w:noProof/>
                 <w:webHidden/>
-                <w:color w:val="000000" w:themeColor="text1"/>
               </w:rPr>
               <w:fldChar w:fldCharType="begin"/>
             </w:r>
@@ -1248,16 +1220,14 @@
                 <w:rFonts w:ascii="Verdana" w:hAnsi="Verdana"/>
                 <w:noProof/>
                 <w:webHidden/>
-                <w:color w:val="000000" w:themeColor="text1"/>
               </w:rPr>
-              <w:instrText xml:space="preserve"> PAGEREF _Toc239453339 \h </w:instrText>
+              <w:instrText xml:space="preserve"> PAGEREF _Toc240279708 \h </w:instrText>
             </w:r>
             <w:r>
               <w:rPr>
                 <w:rFonts w:ascii="Verdana" w:hAnsi="Verdana"/>
                 <w:noProof/>
                 <w:webHidden/>
-                <w:color w:val="000000" w:themeColor="text1"/>
               </w:rPr>
             </w:r>
             <w:r>
@@ -1265,7 +1235,6 @@
                 <w:rFonts w:ascii="Verdana" w:hAnsi="Verdana"/>
                 <w:noProof/>
                 <w:webHidden/>
-                <w:color w:val="000000" w:themeColor="text1"/>
               </w:rPr>
               <w:fldChar w:fldCharType="separate"/>
             </w:r>
@@ -1274,7 +1243,6 @@
                 <w:rFonts w:ascii="Verdana" w:hAnsi="Verdana"/>
                 <w:noProof/>
                 <w:webHidden/>
-                <w:color w:val="000000" w:themeColor="text1"/>
               </w:rPr>
               <w:t>5</w:t>
             </w:r>
@@ -1283,7 +1251,6 @@
                 <w:rFonts w:ascii="Verdana" w:hAnsi="Verdana"/>
                 <w:noProof/>
                 <w:webHidden/>
-                <w:color w:val="000000" w:themeColor="text1"/>
               </w:rPr>
               <w:fldChar w:fldCharType="end"/>
             </w:r>
@@ -1295,23 +1262,21 @@
             <w:tabs>
               <w:tab w:val="right" w:leader="dot" w:pos="9350"/>
             </w:tabs>
-            <w:spacing w:after="0"/>
+            <w:spacing w:after="0" w:line="240" w:lineRule="auto"/>
             <w:rPr>
               <w:rFonts w:ascii="Verdana" w:hAnsi="Verdana"/>
               <w:noProof/>
-              <w:color w:val="000000" w:themeColor="text1"/>
               <w:kern w:val="2"/>
               <w:lang w:val="es-EC" w:eastAsia="es-EC"/>
               <w14:ligatures w14:val="standardContextual"/>
             </w:rPr>
           </w:pPr>
-          <w:hyperlink w:anchor="_Toc239453340" w:history="1">
+          <w:hyperlink w:anchor="_Toc240279709" w:history="1">
             <w:r>
               <w:rPr>
                 <w:rStyle w:val="Hipervnculo"/>
                 <w:rFonts w:ascii="Verdana" w:hAnsi="Verdana"/>
                 <w:noProof/>
-                <w:color w:val="000000" w:themeColor="text1"/>
                 <w:lang w:val="es-EC"/>
               </w:rPr>
               <w:t>EV-03 Revisión Sprint 2</w:t>
@@ -1321,7 +1286,6 @@
                 <w:rFonts w:ascii="Verdana" w:hAnsi="Verdana"/>
                 <w:noProof/>
                 <w:webHidden/>
-                <w:color w:val="000000" w:themeColor="text1"/>
               </w:rPr>
               <w:tab/>
             </w:r>
@@ -1330,7 +1294,6 @@
                 <w:rFonts w:ascii="Verdana" w:hAnsi="Verdana"/>
                 <w:noProof/>
                 <w:webHidden/>
-                <w:color w:val="000000" w:themeColor="text1"/>
               </w:rPr>
               <w:fldChar w:fldCharType="begin"/>
             </w:r>
@@ -1339,16 +1302,14 @@
                 <w:rFonts w:ascii="Verdana" w:hAnsi="Verdana"/>
                 <w:noProof/>
                 <w:webHidden/>
-                <w:color w:val="000000" w:themeColor="text1"/>
               </w:rPr>
-              <w:instrText xml:space="preserve"> PAGEREF _Toc239453340 \h </w:instrText>
+              <w:instrText xml:space="preserve"> PAGEREF _Toc240279709 \h </w:instrText>
             </w:r>
             <w:r>
               <w:rPr>
                 <w:rFonts w:ascii="Verdana" w:hAnsi="Verdana"/>
                 <w:noProof/>
                 <w:webHidden/>
-                <w:color w:val="000000" w:themeColor="text1"/>
               </w:rPr>
             </w:r>
             <w:r>
@@ -1356,7 +1317,6 @@
                 <w:rFonts w:ascii="Verdana" w:hAnsi="Verdana"/>
                 <w:noProof/>
                 <w:webHidden/>
-                <w:color w:val="000000" w:themeColor="text1"/>
               </w:rPr>
               <w:fldChar w:fldCharType="separate"/>
             </w:r>
@@ -1365,7 +1325,6 @@
                 <w:rFonts w:ascii="Verdana" w:hAnsi="Verdana"/>
                 <w:noProof/>
                 <w:webHidden/>
-                <w:color w:val="000000" w:themeColor="text1"/>
               </w:rPr>
               <w:t>6</w:t>
             </w:r>
@@ -1374,7 +1333,88 @@
                 <w:rFonts w:ascii="Verdana" w:hAnsi="Verdana"/>
                 <w:noProof/>
                 <w:webHidden/>
-                <w:color w:val="000000" w:themeColor="text1"/>
+              </w:rPr>
+              <w:fldChar w:fldCharType="end"/>
+            </w:r>
+          </w:hyperlink>
+        </w:p>
+        <w:p>
+          <w:pPr>
+            <w:pStyle w:val="TDC1"/>
+            <w:tabs>
+              <w:tab w:val="right" w:leader="dot" w:pos="9350"/>
+            </w:tabs>
+            <w:spacing w:after="0" w:line="240" w:lineRule="auto"/>
+            <w:rPr>
+              <w:rFonts w:ascii="Verdana" w:hAnsi="Verdana"/>
+              <w:noProof/>
+              <w:kern w:val="2"/>
+              <w:lang w:val="es-EC" w:eastAsia="es-EC"/>
+              <w14:ligatures w14:val="standardContextual"/>
+            </w:rPr>
+          </w:pPr>
+          <w:hyperlink w:anchor="_Toc240279710" w:history="1">
+            <w:r>
+              <w:rPr>
+                <w:rStyle w:val="Hipervnculo"/>
+                <w:rFonts w:ascii="Verdana" w:hAnsi="Verdana"/>
+                <w:noProof/>
+                <w:lang w:val="es-EC"/>
+              </w:rPr>
+              <w:t>EV-04 Revisión Sprint 3</w:t>
+            </w:r>
+            <w:r>
+              <w:rPr>
+                <w:rFonts w:ascii="Verdana" w:hAnsi="Verdana"/>
+                <w:noProof/>
+                <w:webHidden/>
+              </w:rPr>
+              <w:tab/>
+            </w:r>
+            <w:r>
+              <w:rPr>
+                <w:rFonts w:ascii="Verdana" w:hAnsi="Verdana"/>
+                <w:noProof/>
+                <w:webHidden/>
+              </w:rPr>
+              <w:fldChar w:fldCharType="begin"/>
+            </w:r>
+            <w:r>
+              <w:rPr>
+                <w:rFonts w:ascii="Verdana" w:hAnsi="Verdana"/>
+                <w:noProof/>
+                <w:webHidden/>
+              </w:rPr>
+              <w:instrText xml:space="preserve"> PAGEREF _Toc240279710 \h </w:instrText>
+            </w:r>
+            <w:r>
+              <w:rPr>
+                <w:rFonts w:ascii="Verdana" w:hAnsi="Verdana"/>
+                <w:noProof/>
+                <w:webHidden/>
+              </w:rPr>
+            </w:r>
+            <w:r>
+              <w:rPr>
+                <w:rFonts w:ascii="Verdana" w:hAnsi="Verdana"/>
+                <w:noProof/>
+                <w:webHidden/>
+              </w:rPr>
+              <w:fldChar w:fldCharType="separate"/>
+            </w:r>
+            <w:r>
+              <w:rPr>
+                <w:rFonts w:ascii="Verdana" w:hAnsi="Verdana"/>
+                <w:noProof/>
+                <w:webHidden/>
+              </w:rPr>
+              <w:t>8</w:t>
+            </w:r>
+            <w:r>
+              <w:rPr>
+                <w:rFonts w:ascii="Verdana" w:hAnsi="Verdana"/>
+                <w:noProof/>
+                <w:webHidden/>
               </w:rPr>
               <w:fldChar w:fldCharType="end"/>
             </w:r>
@@ -1394,8 +1434,6 @@
               <w:b/>
               <w:bCs/>
               <w:color w:val="000000" w:themeColor="text1"/>
-              <w:sz w:val="18"/>
-              <w:szCs w:val="18"/>
               <w:lang w:val="es-419"/>
             </w:rPr>
             <w:fldChar w:fldCharType="end"/>
@@ -1454,7 +1492,7 @@
         </w:rPr>
         <w:fldChar w:fldCharType="separate"/>
       </w:r>
-      <w:hyperlink w:anchor="_Toc239453367" w:history="1">
+      <w:hyperlink w:anchor="_Toc240280833" w:history="1">
         <w:r>
           <w:rPr>
             <w:rStyle w:val="Hipervnculo"/>
@@ -1482,7 +1520,7 @@
             <w:noProof/>
             <w:webHidden/>
           </w:rPr>
-          <w:instrText xml:space="preserve"> PAGEREF _Toc239453367 \h </w:instrText>
+          <w:instrText xml:space="preserve"> PAGEREF _Toc240280833 \h </w:instrText>
         </w:r>
         <w:r>
           <w:rPr>
@@ -1529,7 +1567,7 @@
           <w14:ligatures w14:val="standardContextual"/>
         </w:rPr>
       </w:pPr>
-      <w:hyperlink w:anchor="_Toc239453368" w:history="1">
+      <w:hyperlink w:anchor="_Toc240280834" w:history="1">
         <w:r>
           <w:rPr>
             <w:rStyle w:val="Hipervnculo"/>
@@ -1558,7 +1596,7 @@
             <w:noProof/>
             <w:webHidden/>
           </w:rPr>
-          <w:instrText xml:space="preserve"> PAGEREF _Toc239453368 \h </w:instrText>
+          <w:instrText xml:space="preserve"> PAGEREF _Toc240280834 \h </w:instrText>
         </w:r>
         <w:r>
           <w:rPr>
@@ -1605,7 +1643,7 @@
           <w14:ligatures w14:val="standardContextual"/>
         </w:rPr>
       </w:pPr>
-      <w:hyperlink w:anchor="_Toc239453369" w:history="1">
+      <w:hyperlink w:anchor="_Toc240280835" w:history="1">
         <w:r>
           <w:rPr>
             <w:rStyle w:val="Hipervnculo"/>
@@ -1634,7 +1672,7 @@
             <w:noProof/>
             <w:webHidden/>
           </w:rPr>
-          <w:instrText xml:space="preserve"> PAGEREF _Toc239453369 \h </w:instrText>
+          <w:instrText xml:space="preserve"> PAGEREF _Toc240280835 \h </w:instrText>
         </w:r>
         <w:r>
           <w:rPr>
@@ -1681,7 +1719,7 @@
           <w14:ligatures w14:val="standardContextual"/>
         </w:rPr>
       </w:pPr>
-      <w:hyperlink w:anchor="_Toc239453370" w:history="1">
+      <w:hyperlink w:anchor="_Toc240280836" w:history="1">
         <w:r>
           <w:rPr>
             <w:rStyle w:val="Hipervnculo"/>
@@ -1710,7 +1748,7 @@
             <w:noProof/>
             <w:webHidden/>
           </w:rPr>
-          <w:instrText xml:space="preserve"> PAGEREF _Toc239453370 \h </w:instrText>
+          <w:instrText xml:space="preserve"> PAGEREF _Toc240280836 \h </w:instrText>
         </w:r>
         <w:r>
           <w:rPr>
@@ -1757,7 +1795,7 @@
           <w14:ligatures w14:val="standardContextual"/>
         </w:rPr>
       </w:pPr>
-      <w:hyperlink w:anchor="_Toc239453371" w:history="1">
+      <w:hyperlink w:anchor="_Toc240280837" w:history="1">
         <w:r>
           <w:rPr>
             <w:rStyle w:val="Hipervnculo"/>
@@ -1786,7 +1824,7 @@
             <w:noProof/>
             <w:webHidden/>
           </w:rPr>
-          <w:instrText xml:space="preserve"> PAGEREF _Toc239453371 \h </w:instrText>
+          <w:instrText xml:space="preserve"> PAGEREF _Toc240280837 \h </w:instrText>
         </w:r>
         <w:r>
           <w:rPr>
@@ -1833,7 +1871,7 @@
           <w14:ligatures w14:val="standardContextual"/>
         </w:rPr>
       </w:pPr>
-      <w:hyperlink w:anchor="_Toc239453372" w:history="1">
+      <w:hyperlink w:anchor="_Toc240280838" w:history="1">
         <w:r>
           <w:rPr>
             <w:rStyle w:val="Hipervnculo"/>
@@ -1841,7 +1879,7 @@
             <w:noProof/>
             <w:lang w:val="es-EC"/>
           </w:rPr>
-          <w:t>Ilustración 6 Evidencia de reunión planificación sprint 2</w:t>
+          <w:t>Ilustración 6 Evidencia de Revisión JIRA</w:t>
         </w:r>
         <w:r>
           <w:rPr>
@@ -1862,7 +1900,7 @@
             <w:noProof/>
             <w:webHidden/>
           </w:rPr>
-          <w:instrText xml:space="preserve"> PAGEREF _Toc239453372 \h </w:instrText>
+          <w:instrText xml:space="preserve"> PAGEREF _Toc240280838 \h </w:instrText>
         </w:r>
         <w:r>
           <w:rPr>
@@ -1895,6 +1933,537 @@
     </w:p>
     <w:p>
       <w:pPr>
+        <w:pStyle w:val="Tabladeilustraciones"/>
+        <w:tabs>
+          <w:tab w:val="right" w:leader="dot" w:pos="9350"/>
+        </w:tabs>
+        <w:rPr>
+          <w:rFonts w:asciiTheme="minorHAnsi" w:eastAsiaTheme="minorEastAsia" w:hAnsiTheme="minorHAnsi" w:cstheme="minorBidi"/>
+          <w:noProof/>
+          <w:kern w:val="2"/>
+          <w:sz w:val="24"/>
+          <w:szCs w:val="24"/>
+          <w:lang w:val="es-EC" w:eastAsia="es-EC"/>
+          <w14:ligatures w14:val="standardContextual"/>
+        </w:rPr>
+      </w:pPr>
+      <w:hyperlink w:anchor="_Toc240280839" w:history="1">
+        <w:r>
+          <w:rPr>
+            <w:rStyle w:val="Hipervnculo"/>
+            <w:rFonts w:ascii="Verdana" w:hAnsi="Verdana"/>
+            <w:noProof/>
+            <w:lang w:val="es-EC"/>
+          </w:rPr>
+          <w:t>Ilustración 7 Evidencia de reunión planificación sprint 2</w:t>
+        </w:r>
+        <w:r>
+          <w:rPr>
+            <w:noProof/>
+            <w:webHidden/>
+          </w:rPr>
+          <w:tab/>
+        </w:r>
+        <w:r>
+          <w:rPr>
+            <w:noProof/>
+            <w:webHidden/>
+          </w:rPr>
+          <w:fldChar w:fldCharType="begin"/>
+        </w:r>
+        <w:r>
+          <w:rPr>
+            <w:noProof/>
+            <w:webHidden/>
+          </w:rPr>
+          <w:instrText xml:space="preserve"> PAGEREF _Toc240280839 \h </w:instrText>
+        </w:r>
+        <w:r>
+          <w:rPr>
+            <w:noProof/>
+            <w:webHidden/>
+          </w:rPr>
+        </w:r>
+        <w:r>
+          <w:rPr>
+            <w:noProof/>
+            <w:webHidden/>
+          </w:rPr>
+          <w:fldChar w:fldCharType="separate"/>
+        </w:r>
+        <w:r>
+          <w:rPr>
+            <w:noProof/>
+            <w:webHidden/>
+          </w:rPr>
+          <w:t>6</w:t>
+        </w:r>
+        <w:r>
+          <w:rPr>
+            <w:noProof/>
+            <w:webHidden/>
+          </w:rPr>
+          <w:fldChar w:fldCharType="end"/>
+        </w:r>
+      </w:hyperlink>
+    </w:p>
+    <w:p>
+      <w:pPr>
+        <w:pStyle w:val="Tabladeilustraciones"/>
+        <w:tabs>
+          <w:tab w:val="right" w:leader="dot" w:pos="9350"/>
+        </w:tabs>
+        <w:rPr>
+          <w:rFonts w:asciiTheme="minorHAnsi" w:eastAsiaTheme="minorEastAsia" w:hAnsiTheme="minorHAnsi" w:cstheme="minorBidi"/>
+          <w:noProof/>
+          <w:kern w:val="2"/>
+          <w:sz w:val="24"/>
+          <w:szCs w:val="24"/>
+          <w:lang w:val="es-EC" w:eastAsia="es-EC"/>
+          <w14:ligatures w14:val="standardContextual"/>
+        </w:rPr>
+      </w:pPr>
+      <w:hyperlink w:anchor="_Toc240280840" w:history="1">
+        <w:r>
+          <w:rPr>
+            <w:rStyle w:val="Hipervnculo"/>
+            <w:rFonts w:ascii="Verdana" w:hAnsi="Verdana"/>
+            <w:noProof/>
+            <w:lang w:val="es-EC"/>
+          </w:rPr>
+          <w:t>Ilustración 8 Estructura del repositorio GIT</w:t>
+        </w:r>
+        <w:r>
+          <w:rPr>
+            <w:noProof/>
+            <w:webHidden/>
+          </w:rPr>
+          <w:tab/>
+        </w:r>
+        <w:r>
+          <w:rPr>
+            <w:noProof/>
+            <w:webHidden/>
+          </w:rPr>
+          <w:fldChar w:fldCharType="begin"/>
+        </w:r>
+        <w:r>
+          <w:rPr>
+            <w:noProof/>
+            <w:webHidden/>
+          </w:rPr>
+          <w:instrText xml:space="preserve"> PAGEREF _Toc240280840 \h </w:instrText>
+        </w:r>
+        <w:r>
+          <w:rPr>
+            <w:noProof/>
+            <w:webHidden/>
+          </w:rPr>
+        </w:r>
+        <w:r>
+          <w:rPr>
+            <w:noProof/>
+            <w:webHidden/>
+          </w:rPr>
+          <w:fldChar w:fldCharType="separate"/>
+        </w:r>
+        <w:r>
+          <w:rPr>
+            <w:noProof/>
+            <w:webHidden/>
+          </w:rPr>
+          <w:t>7</w:t>
+        </w:r>
+        <w:r>
+          <w:rPr>
+            <w:noProof/>
+            <w:webHidden/>
+          </w:rPr>
+          <w:fldChar w:fldCharType="end"/>
+        </w:r>
+      </w:hyperlink>
+    </w:p>
+    <w:p>
+      <w:pPr>
+        <w:pStyle w:val="Tabladeilustraciones"/>
+        <w:tabs>
+          <w:tab w:val="right" w:leader="dot" w:pos="9350"/>
+        </w:tabs>
+        <w:rPr>
+          <w:rFonts w:asciiTheme="minorHAnsi" w:eastAsiaTheme="minorEastAsia" w:hAnsiTheme="minorHAnsi" w:cstheme="minorBidi"/>
+          <w:noProof/>
+          <w:kern w:val="2"/>
+          <w:sz w:val="24"/>
+          <w:szCs w:val="24"/>
+          <w:lang w:val="es-EC" w:eastAsia="es-EC"/>
+          <w14:ligatures w14:val="standardContextual"/>
+        </w:rPr>
+      </w:pPr>
+      <w:hyperlink w:anchor="_Toc240280841" w:history="1">
+        <w:r>
+          <w:rPr>
+            <w:rStyle w:val="Hipervnculo"/>
+            <w:rFonts w:ascii="Verdana" w:hAnsi="Verdana"/>
+            <w:noProof/>
+            <w:lang w:val="es-EC"/>
+          </w:rPr>
+          <w:t>Ilustración 9 Estructura de ventanas wireframe</w:t>
+        </w:r>
+        <w:r>
+          <w:rPr>
+            <w:noProof/>
+            <w:webHidden/>
+          </w:rPr>
+          <w:tab/>
+        </w:r>
+        <w:r>
+          <w:rPr>
+            <w:noProof/>
+            <w:webHidden/>
+          </w:rPr>
+          <w:fldChar w:fldCharType="begin"/>
+        </w:r>
+        <w:r>
+          <w:rPr>
+            <w:noProof/>
+            <w:webHidden/>
+          </w:rPr>
+          <w:instrText xml:space="preserve"> PAGEREF _Toc240280841 \h </w:instrText>
+        </w:r>
+        <w:r>
+          <w:rPr>
+            <w:noProof/>
+            <w:webHidden/>
+          </w:rPr>
+        </w:r>
+        <w:r>
+          <w:rPr>
+            <w:noProof/>
+            <w:webHidden/>
+          </w:rPr>
+          <w:fldChar w:fldCharType="separate"/>
+        </w:r>
+        <w:r>
+          <w:rPr>
+            <w:noProof/>
+            <w:webHidden/>
+          </w:rPr>
+          <w:t>7</w:t>
+        </w:r>
+        <w:r>
+          <w:rPr>
+            <w:noProof/>
+            <w:webHidden/>
+          </w:rPr>
+          <w:fldChar w:fldCharType="end"/>
+        </w:r>
+      </w:hyperlink>
+    </w:p>
+    <w:p>
+      <w:pPr>
+        <w:pStyle w:val="Tabladeilustraciones"/>
+        <w:tabs>
+          <w:tab w:val="right" w:leader="dot" w:pos="9350"/>
+        </w:tabs>
+        <w:rPr>
+          <w:rFonts w:asciiTheme="minorHAnsi" w:eastAsiaTheme="minorEastAsia" w:hAnsiTheme="minorHAnsi" w:cstheme="minorBidi"/>
+          <w:noProof/>
+          <w:kern w:val="2"/>
+          <w:sz w:val="24"/>
+          <w:szCs w:val="24"/>
+          <w:lang w:val="es-EC" w:eastAsia="es-EC"/>
+          <w14:ligatures w14:val="standardContextual"/>
+        </w:rPr>
+      </w:pPr>
+      <w:hyperlink w:anchor="_Toc240280842" w:history="1">
+        <w:r>
+          <w:rPr>
+            <w:rStyle w:val="Hipervnculo"/>
+            <w:rFonts w:ascii="Verdana" w:hAnsi="Verdana"/>
+            <w:noProof/>
+            <w:lang w:val="es-EC"/>
+          </w:rPr>
+          <w:t>Ilustración 10 Evidencia de Revisión de wireframe</w:t>
+        </w:r>
+        <w:r>
+          <w:rPr>
+            <w:noProof/>
+            <w:webHidden/>
+          </w:rPr>
+          <w:tab/>
+        </w:r>
+        <w:r>
+          <w:rPr>
+            <w:noProof/>
+            <w:webHidden/>
+          </w:rPr>
+          <w:fldChar w:fldCharType="begin"/>
+        </w:r>
+        <w:r>
+          <w:rPr>
+            <w:noProof/>
+            <w:webHidden/>
+          </w:rPr>
+          <w:instrText xml:space="preserve"> PAGEREF _Toc240280842 \h </w:instrText>
+        </w:r>
+        <w:r>
+          <w:rPr>
+            <w:noProof/>
+            <w:webHidden/>
+          </w:rPr>
+        </w:r>
+        <w:r>
+          <w:rPr>
+            <w:noProof/>
+            <w:webHidden/>
+          </w:rPr>
+          <w:fldChar w:fldCharType="separate"/>
+        </w:r>
+        <w:r>
+          <w:rPr>
+            <w:noProof/>
+            <w:webHidden/>
+          </w:rPr>
+          <w:t>8</w:t>
+        </w:r>
+        <w:r>
+          <w:rPr>
+            <w:noProof/>
+            <w:webHidden/>
+          </w:rPr>
+          <w:fldChar w:fldCharType="end"/>
+        </w:r>
+      </w:hyperlink>
+    </w:p>
+    <w:p>
+      <w:pPr>
+        <w:pStyle w:val="Tabladeilustraciones"/>
+        <w:tabs>
+          <w:tab w:val="right" w:leader="dot" w:pos="9350"/>
+        </w:tabs>
+        <w:rPr>
+          <w:rFonts w:asciiTheme="minorHAnsi" w:eastAsiaTheme="minorEastAsia" w:hAnsiTheme="minorHAnsi" w:cstheme="minorBidi"/>
+          <w:noProof/>
+          <w:kern w:val="2"/>
+          <w:sz w:val="24"/>
+          <w:szCs w:val="24"/>
+          <w:lang w:val="es-EC" w:eastAsia="es-EC"/>
+          <w14:ligatures w14:val="standardContextual"/>
+        </w:rPr>
+      </w:pPr>
+      <w:hyperlink w:anchor="_Toc240280843" w:history="1">
+        <w:r>
+          <w:rPr>
+            <w:rStyle w:val="Hipervnculo"/>
+            <w:rFonts w:ascii="Verdana" w:hAnsi="Verdana"/>
+            <w:noProof/>
+            <w:lang w:val="es-EC"/>
+          </w:rPr>
+          <w:t>Ilustración 11 Evidencia de reunión planificación sprint 3</w:t>
+        </w:r>
+        <w:r>
+          <w:rPr>
+            <w:noProof/>
+            <w:webHidden/>
+          </w:rPr>
+          <w:tab/>
+        </w:r>
+        <w:r>
+          <w:rPr>
+            <w:noProof/>
+            <w:webHidden/>
+          </w:rPr>
+          <w:fldChar w:fldCharType="begin"/>
+        </w:r>
+        <w:r>
+          <w:rPr>
+            <w:noProof/>
+            <w:webHidden/>
+          </w:rPr>
+          <w:instrText xml:space="preserve"> PAGEREF _Toc240280843 \h </w:instrText>
+        </w:r>
+        <w:r>
+          <w:rPr>
+            <w:noProof/>
+            <w:webHidden/>
+          </w:rPr>
+        </w:r>
+        <w:r>
+          <w:rPr>
+            <w:noProof/>
+            <w:webHidden/>
+          </w:rPr>
+          <w:fldChar w:fldCharType="separate"/>
+        </w:r>
+        <w:r>
+          <w:rPr>
+            <w:noProof/>
+            <w:webHidden/>
+          </w:rPr>
+          <w:t>8</w:t>
+        </w:r>
+        <w:r>
+          <w:rPr>
+            <w:noProof/>
+            <w:webHidden/>
+          </w:rPr>
+          <w:fldChar w:fldCharType="end"/>
+        </w:r>
+      </w:hyperlink>
+    </w:p>
+    <w:p>
+      <w:pPr>
+        <w:pStyle w:val="Tabladeilustraciones"/>
+        <w:tabs>
+          <w:tab w:val="right" w:leader="dot" w:pos="9350"/>
+        </w:tabs>
+        <w:rPr>
+          <w:rFonts w:asciiTheme="minorHAnsi" w:eastAsiaTheme="minorEastAsia" w:hAnsiTheme="minorHAnsi" w:cstheme="minorBidi"/>
+          <w:noProof/>
+          <w:kern w:val="2"/>
+          <w:sz w:val="24"/>
+          <w:szCs w:val="24"/>
+          <w:lang w:val="es-EC" w:eastAsia="es-EC"/>
+          <w14:ligatures w14:val="standardContextual"/>
+        </w:rPr>
+      </w:pPr>
+      <w:hyperlink w:anchor="_Toc240280844" w:history="1">
+        <w:r>
+          <w:rPr>
+            <w:rStyle w:val="Hipervnculo"/>
+            <w:rFonts w:ascii="Verdana" w:hAnsi="Verdana"/>
+            <w:noProof/>
+          </w:rPr>
+          <w:t>Ilustración 12 Evidencia Cronograma  JIRA</w:t>
+        </w:r>
+        <w:r>
+          <w:rPr>
+            <w:noProof/>
+            <w:webHidden/>
+          </w:rPr>
+          <w:tab/>
+        </w:r>
+        <w:r>
+          <w:rPr>
+            <w:noProof/>
+            <w:webHidden/>
+          </w:rPr>
+          <w:fldChar w:fldCharType="begin"/>
+        </w:r>
+        <w:r>
+          <w:rPr>
+            <w:noProof/>
+            <w:webHidden/>
+          </w:rPr>
+          <w:instrText xml:space="preserve"> PAGEREF _Toc240280844 \h </w:instrText>
+        </w:r>
+        <w:r>
+          <w:rPr>
+            <w:noProof/>
+            <w:webHidden/>
+          </w:rPr>
+        </w:r>
+        <w:r>
+          <w:rPr>
+            <w:noProof/>
+            <w:webHidden/>
+          </w:rPr>
+          <w:fldChar w:fldCharType="separate"/>
+        </w:r>
+        <w:r>
+          <w:rPr>
+            <w:noProof/>
+            <w:webHidden/>
+          </w:rPr>
+          <w:t>9</w:t>
+        </w:r>
+        <w:r>
+          <w:rPr>
+            <w:noProof/>
+            <w:webHidden/>
+          </w:rPr>
+          <w:fldChar w:fldCharType="end"/>
+        </w:r>
+      </w:hyperlink>
+    </w:p>
+    <w:p>
+      <w:pPr>
+        <w:pStyle w:val="Tabladeilustraciones"/>
+        <w:tabs>
+          <w:tab w:val="right" w:leader="dot" w:pos="9350"/>
+        </w:tabs>
+        <w:rPr>
+          <w:rFonts w:asciiTheme="minorHAnsi" w:eastAsiaTheme="minorEastAsia" w:hAnsiTheme="minorHAnsi" w:cstheme="minorBidi"/>
+          <w:noProof/>
+          <w:kern w:val="2"/>
+          <w:sz w:val="24"/>
+          <w:szCs w:val="24"/>
+          <w:lang w:val="es-EC" w:eastAsia="es-EC"/>
+          <w14:ligatures w14:val="standardContextual"/>
+        </w:rPr>
+      </w:pPr>
+      <w:hyperlink w:anchor="_Toc240280845" w:history="1">
+        <w:r>
+          <w:rPr>
+            <w:rStyle w:val="Hipervnculo"/>
+            <w:rFonts w:ascii="Verdana" w:hAnsi="Verdana"/>
+            <w:noProof/>
+          </w:rPr>
+          <w:t>Ilustración 13 Evidencia BPMn</w:t>
+        </w:r>
+        <w:r>
+          <w:rPr>
+            <w:noProof/>
+            <w:webHidden/>
+          </w:rPr>
+          <w:tab/>
+        </w:r>
+        <w:r>
+          <w:rPr>
+            <w:noProof/>
+            <w:webHidden/>
+          </w:rPr>
+          <w:fldChar w:fldCharType="begin"/>
+        </w:r>
+        <w:r>
+          <w:rPr>
+            <w:noProof/>
+            <w:webHidden/>
+          </w:rPr>
+          <w:instrText xml:space="preserve"> PAGEREF _Toc240280845 \h </w:instrText>
+        </w:r>
+        <w:r>
+          <w:rPr>
+            <w:noProof/>
+            <w:webHidden/>
+          </w:rPr>
+        </w:r>
+        <w:r>
+          <w:rPr>
+            <w:noProof/>
+            <w:webHidden/>
+          </w:rPr>
+          <w:fldChar w:fldCharType="separate"/>
+        </w:r>
+        <w:r>
+          <w:rPr>
+            <w:noProof/>
+            <w:webHidden/>
+          </w:rPr>
+          <w:t>9</w:t>
+        </w:r>
+        <w:r>
+          <w:rPr>
+            <w:noProof/>
+            <w:webHidden/>
+          </w:rPr>
+          <w:fldChar w:fldCharType="end"/>
+        </w:r>
+      </w:hyperlink>
+    </w:p>
+    <w:p>
+      <w:pPr>
+        <w:spacing w:after="0"/>
         <w:rPr>
           <w:lang w:val="es-419"/>
         </w:rPr>
@@ -1943,7 +2512,7 @@
           <w:lang w:val="es-EC"/>
         </w:rPr>
       </w:pPr>
-      <w:bookmarkStart w:id="0" w:name="_Toc239453337"/>
+      <w:bookmarkStart w:id="0" w:name="_Toc240279706"/>
       <w:r>
         <w:rPr>
           <w:rFonts w:ascii="Verdana" w:hAnsi="Verdana"/>
@@ -1984,7 +2553,7 @@
           <w:szCs w:val="32"/>
         </w:rPr>
       </w:pPr>
-      <w:bookmarkStart w:id="1" w:name="_Toc239453338"/>
+      <w:bookmarkStart w:id="1" w:name="_Toc240279707"/>
       <w:r>
         <w:rPr>
           <w:rFonts w:ascii="Verdana" w:hAnsi="Verdana"/>
@@ -1992,7 +2561,27 @@
           <w:sz w:val="32"/>
           <w:szCs w:val="32"/>
         </w:rPr>
-        <w:t>EV-01. Reunión de Sprint Planning</w:t>
+        <w:t xml:space="preserve">EV-01. </w:t>
+      </w:r>
+      <w:proofErr w:type="spellStart"/>
+      <w:r>
+        <w:rPr>
+          <w:rFonts w:ascii="Verdana" w:hAnsi="Verdana"/>
+          <w:color w:val="943634" w:themeColor="accent2" w:themeShade="BF"/>
+          <w:sz w:val="32"/>
+          <w:szCs w:val="32"/>
+        </w:rPr>
+        <w:t>Reunión</w:t>
+      </w:r>
+      <w:proofErr w:type="spellEnd"/>
+      <w:r>
+        <w:rPr>
+          <w:rFonts w:ascii="Verdana" w:hAnsi="Verdana"/>
+          <w:color w:val="943634" w:themeColor="accent2" w:themeShade="BF"/>
+          <w:sz w:val="32"/>
+          <w:szCs w:val="32"/>
+        </w:rPr>
+        <w:t xml:space="preserve"> de Sprint Planning</w:t>
       </w:r>
       <w:bookmarkEnd w:id="1"/>
     </w:p>
@@ -2061,65 +2650,147 @@
     </w:p>
     <w:p>
       <w:pPr>
-        <w:spacing w:before="120" w:after="120"/>
+        <w:pStyle w:val="Descripcin"/>
         <w:jc w:val="center"/>
         <w:rPr>
           <w:rFonts w:ascii="Verdana" w:hAnsi="Verdana"/>
-          <w:color w:val="943634" w:themeColor="accent2" w:themeShade="BF"/>
+          <w:b w:val="0"/>
+          <w:bCs w:val="0"/>
+          <w:color w:val="auto"/>
+          <w:sz w:val="22"/>
+          <w:szCs w:val="22"/>
         </w:rPr>
       </w:pPr>
-      <w:bookmarkStart w:id="2" w:name="_Toc239453367"/>
+      <w:bookmarkStart w:id="2" w:name="_Toc240280833"/>
+      <w:proofErr w:type="spellStart"/>
       <w:r>
         <w:rPr>
           <w:rFonts w:ascii="Verdana" w:hAnsi="Verdana"/>
-          <w:color w:val="943634" w:themeColor="accent2" w:themeShade="BF"/>
+          <w:b w:val="0"/>
+          <w:bCs w:val="0"/>
+          <w:color w:val="auto"/>
+          <w:sz w:val="22"/>
+          <w:szCs w:val="22"/>
         </w:rPr>
-        <w:t xml:space="preserve">Ilustración </w:t>
+        <w:t>Ilustración</w:t>
+      </w:r>
+      <w:proofErr w:type="spellEnd"/>
+      <w:r>
+        <w:rPr>
+          <w:rFonts w:ascii="Verdana" w:hAnsi="Verdana"/>
+          <w:b w:val="0"/>
+          <w:bCs w:val="0"/>
+          <w:color w:val="auto"/>
+          <w:sz w:val="22"/>
+          <w:szCs w:val="22"/>
+        </w:rPr>
+        <w:t xml:space="preserve"> </w:t>
       </w:r>
       <w:r>
         <w:rPr>
           <w:rFonts w:ascii="Verdana" w:hAnsi="Verdana"/>
-          <w:color w:val="943634" w:themeColor="accent2" w:themeShade="BF"/>
+          <w:b w:val="0"/>
+          <w:bCs w:val="0"/>
+          <w:color w:val="auto"/>
+          <w:sz w:val="22"/>
+          <w:szCs w:val="22"/>
         </w:rPr>
         <w:fldChar w:fldCharType="begin"/>
       </w:r>
       <w:r>
         <w:rPr>
           <w:rFonts w:ascii="Verdana" w:hAnsi="Verdana"/>
-          <w:color w:val="943634" w:themeColor="accent2" w:themeShade="BF"/>
+          <w:b w:val="0"/>
+          <w:bCs w:val="0"/>
+          <w:color w:val="auto"/>
+          <w:sz w:val="22"/>
+          <w:szCs w:val="22"/>
         </w:rPr>
         <w:instrText xml:space="preserve"> SEQ Ilustración \* ARABIC </w:instrText>
       </w:r>
       <w:r>
         <w:rPr>
           <w:rFonts w:ascii="Verdana" w:hAnsi="Verdana"/>
-          <w:color w:val="943634" w:themeColor="accent2" w:themeShade="BF"/>
+          <w:b w:val="0"/>
+          <w:bCs w:val="0"/>
+          <w:color w:val="auto"/>
+          <w:sz w:val="22"/>
+          <w:szCs w:val="22"/>
         </w:rPr>
         <w:fldChar w:fldCharType="separate"/>
       </w:r>
       <w:r>
         <w:rPr>
           <w:rFonts w:ascii="Verdana" w:hAnsi="Verdana"/>
+          <w:b w:val="0"/>
+          <w:bCs w:val="0"/>
           <w:noProof/>
-          <w:color w:val="943634" w:themeColor="accent2" w:themeShade="BF"/>
+          <w:color w:val="auto"/>
+          <w:sz w:val="22"/>
+          <w:szCs w:val="22"/>
         </w:rPr>
         <w:t>1</w:t>
       </w:r>
       <w:r>
         <w:rPr>
           <w:rFonts w:ascii="Verdana" w:hAnsi="Verdana"/>
-          <w:color w:val="943634" w:themeColor="accent2" w:themeShade="BF"/>
+          <w:b w:val="0"/>
+          <w:bCs w:val="0"/>
+          <w:color w:val="auto"/>
+          <w:sz w:val="22"/>
+          <w:szCs w:val="22"/>
         </w:rPr>
         <w:fldChar w:fldCharType="end"/>
       </w:r>
       <w:r>
         <w:rPr>
           <w:rFonts w:ascii="Verdana" w:hAnsi="Verdana"/>
-          <w:color w:val="943634" w:themeColor="accent2" w:themeShade="BF"/>
+          <w:b w:val="0"/>
+          <w:bCs w:val="0"/>
+          <w:color w:val="auto"/>
+          <w:sz w:val="22"/>
+          <w:szCs w:val="22"/>
         </w:rPr>
-        <w:t xml:space="preserve"> Evidencia de Reunión</w:t>
+        <w:t xml:space="preserve"> </w:t>
+      </w:r>
+      <w:proofErr w:type="spellStart"/>
+      <w:r>
+        <w:rPr>
+          <w:rFonts w:ascii="Verdana" w:hAnsi="Verdana"/>
+          <w:b w:val="0"/>
+          <w:bCs w:val="0"/>
+          <w:color w:val="auto"/>
+          <w:sz w:val="22"/>
+          <w:szCs w:val="22"/>
+        </w:rPr>
+        <w:t>Evidencia</w:t>
+      </w:r>
+      <w:proofErr w:type="spellEnd"/>
+      <w:r>
+        <w:rPr>
+          <w:rFonts w:ascii="Verdana" w:hAnsi="Verdana"/>
+          <w:b w:val="0"/>
+          <w:bCs w:val="0"/>
+          <w:color w:val="auto"/>
+          <w:sz w:val="22"/>
+          <w:szCs w:val="22"/>
+        </w:rPr>
+        <w:t xml:space="preserve"> de </w:t>
+      </w:r>
+      <w:proofErr w:type="spellStart"/>
+      <w:r>
+        <w:rPr>
+          <w:rFonts w:ascii="Verdana" w:hAnsi="Verdana"/>
+          <w:b w:val="0"/>
+          <w:bCs w:val="0"/>
+          <w:color w:val="auto"/>
+          <w:sz w:val="22"/>
+          <w:szCs w:val="22"/>
+        </w:rPr>
+        <w:t>Reunión</w:t>
       </w:r>
       <w:bookmarkEnd w:id="2"/>
+      <w:proofErr w:type="spellEnd"/>
     </w:p>
     <w:p>
       <w:pPr>
@@ -2189,19 +2860,27 @@
     </w:p>
     <w:p>
       <w:pPr>
-        <w:spacing w:before="120" w:after="120"/>
+        <w:pStyle w:val="Descripcin"/>
         <w:jc w:val="center"/>
         <w:rPr>
           <w:rFonts w:ascii="Verdana" w:hAnsi="Verdana"/>
-          <w:color w:val="943634" w:themeColor="accent2" w:themeShade="BF"/>
+          <w:b w:val="0"/>
+          <w:bCs w:val="0"/>
+          <w:color w:val="auto"/>
+          <w:sz w:val="22"/>
+          <w:szCs w:val="22"/>
           <w:lang w:val="es-EC"/>
         </w:rPr>
       </w:pPr>
-      <w:bookmarkStart w:id="3" w:name="_Toc239453368"/>
+      <w:bookmarkStart w:id="3" w:name="_Toc240280834"/>
       <w:r>
         <w:rPr>
           <w:rFonts w:ascii="Verdana" w:hAnsi="Verdana"/>
-          <w:color w:val="943634" w:themeColor="accent2" w:themeShade="BF"/>
+          <w:b w:val="0"/>
+          <w:bCs w:val="0"/>
+          <w:color w:val="auto"/>
+          <w:sz w:val="22"/>
+          <w:szCs w:val="22"/>
           <w:lang w:val="es-EC"/>
         </w:rPr>
         <w:t xml:space="preserve">Ilustración </w:t>
@@ -2209,14 +2888,22 @@
       <w:r>
         <w:rPr>
           <w:rFonts w:ascii="Verdana" w:hAnsi="Verdana"/>
-          <w:color w:val="943634" w:themeColor="accent2" w:themeShade="BF"/>
+          <w:b w:val="0"/>
+          <w:bCs w:val="0"/>
+          <w:color w:val="auto"/>
+          <w:sz w:val="22"/>
+          <w:szCs w:val="22"/>
         </w:rPr>
         <w:fldChar w:fldCharType="begin"/>
       </w:r>
       <w:r>
         <w:rPr>
           <w:rFonts w:ascii="Verdana" w:hAnsi="Verdana"/>
-          <w:color w:val="943634" w:themeColor="accent2" w:themeShade="BF"/>
+          <w:b w:val="0"/>
+          <w:bCs w:val="0"/>
+          <w:color w:val="auto"/>
+          <w:sz w:val="22"/>
+          <w:szCs w:val="22"/>
           <w:lang w:val="es-EC"/>
         </w:rPr>
         <w:instrText xml:space="preserve"> SEQ Ilustración \* ARABIC </w:instrText>
@@ -2224,15 +2911,23 @@
       <w:r>
         <w:rPr>
           <w:rFonts w:ascii="Verdana" w:hAnsi="Verdana"/>
-          <w:color w:val="943634" w:themeColor="accent2" w:themeShade="BF"/>
+          <w:b w:val="0"/>
+          <w:bCs w:val="0"/>
+          <w:color w:val="auto"/>
+          <w:sz w:val="22"/>
+          <w:szCs w:val="22"/>
         </w:rPr>
         <w:fldChar w:fldCharType="separate"/>
       </w:r>
       <w:r>
         <w:rPr>
           <w:rFonts w:ascii="Verdana" w:hAnsi="Verdana"/>
+          <w:b w:val="0"/>
+          <w:bCs w:val="0"/>
           <w:noProof/>
-          <w:color w:val="943634" w:themeColor="accent2" w:themeShade="BF"/>
+          <w:color w:val="auto"/>
+          <w:sz w:val="22"/>
+          <w:szCs w:val="22"/>
           <w:lang w:val="es-EC"/>
         </w:rPr>
         <w:t>2</w:t>
@@ -2240,14 +2935,22 @@
       <w:r>
         <w:rPr>
           <w:rFonts w:ascii="Verdana" w:hAnsi="Verdana"/>
-          <w:color w:val="943634" w:themeColor="accent2" w:themeShade="BF"/>
+          <w:b w:val="0"/>
+          <w:bCs w:val="0"/>
+          <w:color w:val="auto"/>
+          <w:sz w:val="22"/>
+          <w:szCs w:val="22"/>
         </w:rPr>
         <w:fldChar w:fldCharType="end"/>
       </w:r>
       <w:r>
         <w:rPr>
           <w:rFonts w:ascii="Verdana" w:hAnsi="Verdana"/>
-          <w:color w:val="943634" w:themeColor="accent2" w:themeShade="BF"/>
+          <w:b w:val="0"/>
+          <w:bCs w:val="0"/>
+          <w:color w:val="auto"/>
+          <w:sz w:val="22"/>
+          <w:szCs w:val="22"/>
           <w:lang w:val="es-EC"/>
         </w:rPr>
         <w:t xml:space="preserve"> Evidencia de Revisión de Documentos</w:t>
@@ -2321,19 +3024,27 @@
     </w:p>
     <w:p>
       <w:pPr>
-        <w:spacing w:before="120" w:after="120"/>
+        <w:pStyle w:val="Descripcin"/>
         <w:jc w:val="center"/>
         <w:rPr>
           <w:rFonts w:ascii="Verdana" w:hAnsi="Verdana"/>
-          <w:color w:val="943634" w:themeColor="accent2" w:themeShade="BF"/>
+          <w:b w:val="0"/>
+          <w:bCs w:val="0"/>
+          <w:color w:val="auto"/>
+          <w:sz w:val="22"/>
+          <w:szCs w:val="22"/>
           <w:lang w:val="es-EC"/>
         </w:rPr>
       </w:pPr>
-      <w:bookmarkStart w:id="4" w:name="_Toc239453369"/>
+      <w:bookmarkStart w:id="4" w:name="_Toc240280835"/>
       <w:r>
         <w:rPr>
           <w:rFonts w:ascii="Verdana" w:hAnsi="Verdana"/>
-          <w:color w:val="943634" w:themeColor="accent2" w:themeShade="BF"/>
+          <w:b w:val="0"/>
+          <w:bCs w:val="0"/>
+          <w:color w:val="auto"/>
+          <w:sz w:val="22"/>
+          <w:szCs w:val="22"/>
           <w:lang w:val="es-EC"/>
         </w:rPr>
         <w:t xml:space="preserve">Ilustración </w:t>
@@ -2341,14 +3052,22 @@
       <w:r>
         <w:rPr>
           <w:rFonts w:ascii="Verdana" w:hAnsi="Verdana"/>
-          <w:color w:val="943634" w:themeColor="accent2" w:themeShade="BF"/>
+          <w:b w:val="0"/>
+          <w:bCs w:val="0"/>
+          <w:color w:val="auto"/>
+          <w:sz w:val="22"/>
+          <w:szCs w:val="22"/>
         </w:rPr>
         <w:fldChar w:fldCharType="begin"/>
       </w:r>
       <w:r>
         <w:rPr>
           <w:rFonts w:ascii="Verdana" w:hAnsi="Verdana"/>
-          <w:color w:val="943634" w:themeColor="accent2" w:themeShade="BF"/>
+          <w:b w:val="0"/>
+          <w:bCs w:val="0"/>
+          <w:color w:val="auto"/>
+          <w:sz w:val="22"/>
+          <w:szCs w:val="22"/>
           <w:lang w:val="es-EC"/>
         </w:rPr>
         <w:instrText xml:space="preserve"> SEQ Ilustración \* ARABIC </w:instrText>
@@ -2356,15 +3075,23 @@
       <w:r>
         <w:rPr>
           <w:rFonts w:ascii="Verdana" w:hAnsi="Verdana"/>
-          <w:color w:val="943634" w:themeColor="accent2" w:themeShade="BF"/>
+          <w:b w:val="0"/>
+          <w:bCs w:val="0"/>
+          <w:color w:val="auto"/>
+          <w:sz w:val="22"/>
+          <w:szCs w:val="22"/>
         </w:rPr>
         <w:fldChar w:fldCharType="separate"/>
       </w:r>
       <w:r>
         <w:rPr>
           <w:rFonts w:ascii="Verdana" w:hAnsi="Verdana"/>
+          <w:b w:val="0"/>
+          <w:bCs w:val="0"/>
           <w:noProof/>
-          <w:color w:val="943634" w:themeColor="accent2" w:themeShade="BF"/>
+          <w:color w:val="auto"/>
+          <w:sz w:val="22"/>
+          <w:szCs w:val="22"/>
           <w:lang w:val="es-EC"/>
         </w:rPr>
         <w:t>3</w:t>
@@ -2372,14 +3099,22 @@
       <w:r>
         <w:rPr>
           <w:rFonts w:ascii="Verdana" w:hAnsi="Verdana"/>
-          <w:color w:val="943634" w:themeColor="accent2" w:themeShade="BF"/>
+          <w:b w:val="0"/>
+          <w:bCs w:val="0"/>
+          <w:color w:val="auto"/>
+          <w:sz w:val="22"/>
+          <w:szCs w:val="22"/>
         </w:rPr>
         <w:fldChar w:fldCharType="end"/>
       </w:r>
       <w:r>
         <w:rPr>
           <w:rFonts w:ascii="Verdana" w:hAnsi="Verdana"/>
-          <w:color w:val="943634" w:themeColor="accent2" w:themeShade="BF"/>
+          <w:b w:val="0"/>
+          <w:bCs w:val="0"/>
+          <w:color w:val="auto"/>
+          <w:sz w:val="22"/>
+          <w:szCs w:val="22"/>
           <w:lang w:val="es-EC"/>
         </w:rPr>
         <w:t xml:space="preserve"> Evidencia de panel para proyecto</w:t>
@@ -2397,7 +3132,7 @@
           <w:lang w:val="es-EC"/>
         </w:rPr>
       </w:pPr>
-      <w:bookmarkStart w:id="5" w:name="_Toc239453339"/>
+      <w:bookmarkStart w:id="5" w:name="_Toc240279708"/>
       <w:r>
         <w:rPr>
           <w:rFonts w:ascii="Verdana" w:hAnsi="Verdana"/>
@@ -2467,19 +3202,19 @@
           <w:rFonts w:ascii="Verdana" w:hAnsi="Verdana"/>
           <w:b w:val="0"/>
           <w:bCs w:val="0"/>
-          <w:color w:val="943634" w:themeColor="accent2" w:themeShade="BF"/>
+          <w:color w:val="auto"/>
           <w:sz w:val="22"/>
           <w:szCs w:val="22"/>
           <w:lang w:val="es-EC"/>
         </w:rPr>
       </w:pPr>
-      <w:bookmarkStart w:id="6" w:name="_Toc239453370"/>
+      <w:bookmarkStart w:id="6" w:name="_Toc240280836"/>
       <w:r>
         <w:rPr>
           <w:rFonts w:ascii="Verdana" w:hAnsi="Verdana"/>
           <w:b w:val="0"/>
           <w:bCs w:val="0"/>
-          <w:color w:val="943634" w:themeColor="accent2" w:themeShade="BF"/>
+          <w:color w:val="auto"/>
           <w:sz w:val="22"/>
           <w:szCs w:val="22"/>
           <w:lang w:val="es-EC"/>
@@ -2491,7 +3226,7 @@
           <w:rFonts w:ascii="Verdana" w:hAnsi="Verdana"/>
           <w:b w:val="0"/>
           <w:bCs w:val="0"/>
-          <w:color w:val="943634" w:themeColor="accent2" w:themeShade="BF"/>
+          <w:color w:val="auto"/>
           <w:sz w:val="22"/>
           <w:szCs w:val="22"/>
         </w:rPr>
@@ -2502,7 +3237,7 @@
           <w:rFonts w:ascii="Verdana" w:hAnsi="Verdana"/>
           <w:b w:val="0"/>
           <w:bCs w:val="0"/>
-          <w:color w:val="943634" w:themeColor="accent2" w:themeShade="BF"/>
+          <w:color w:val="auto"/>
           <w:sz w:val="22"/>
           <w:szCs w:val="22"/>
           <w:lang w:val="es-EC"/>
@@ -2514,7 +3249,7 @@
           <w:rFonts w:ascii="Verdana" w:hAnsi="Verdana"/>
           <w:b w:val="0"/>
           <w:bCs w:val="0"/>
-          <w:color w:val="943634" w:themeColor="accent2" w:themeShade="BF"/>
+          <w:color w:val="auto"/>
           <w:sz w:val="22"/>
           <w:szCs w:val="22"/>
         </w:rPr>
@@ -2526,7 +3261,7 @@
           <w:b w:val="0"/>
           <w:bCs w:val="0"/>
           <w:noProof/>
-          <w:color w:val="943634" w:themeColor="accent2" w:themeShade="BF"/>
+          <w:color w:val="auto"/>
           <w:sz w:val="22"/>
           <w:szCs w:val="22"/>
           <w:lang w:val="es-EC"/>
@@ -2538,7 +3273,7 @@
           <w:rFonts w:ascii="Verdana" w:hAnsi="Verdana"/>
           <w:b w:val="0"/>
           <w:bCs w:val="0"/>
-          <w:color w:val="943634" w:themeColor="accent2" w:themeShade="BF"/>
+          <w:color w:val="auto"/>
           <w:sz w:val="22"/>
           <w:szCs w:val="22"/>
         </w:rPr>
@@ -2549,7 +3284,7 @@
           <w:rFonts w:ascii="Verdana" w:hAnsi="Verdana"/>
           <w:b w:val="0"/>
           <w:bCs w:val="0"/>
-          <w:color w:val="943634" w:themeColor="accent2" w:themeShade="BF"/>
+          <w:color w:val="auto"/>
           <w:sz w:val="22"/>
           <w:szCs w:val="22"/>
           <w:lang w:val="es-EC"/>
@@ -2614,19 +3349,19 @@
           <w:rFonts w:ascii="Verdana" w:hAnsi="Verdana"/>
           <w:b w:val="0"/>
           <w:bCs w:val="0"/>
-          <w:color w:val="943634" w:themeColor="accent2" w:themeShade="BF"/>
+          <w:color w:val="auto"/>
           <w:sz w:val="22"/>
           <w:szCs w:val="22"/>
           <w:lang w:val="es-EC"/>
         </w:rPr>
       </w:pPr>
-      <w:bookmarkStart w:id="7" w:name="_Toc239453371"/>
+      <w:bookmarkStart w:id="7" w:name="_Toc240280837"/>
       <w:r>
         <w:rPr>
           <w:rFonts w:ascii="Verdana" w:hAnsi="Verdana"/>
           <w:b w:val="0"/>
           <w:bCs w:val="0"/>
-          <w:color w:val="943634" w:themeColor="accent2" w:themeShade="BF"/>
+          <w:color w:val="auto"/>
           <w:sz w:val="22"/>
           <w:szCs w:val="22"/>
           <w:lang w:val="es-EC"/>
@@ -2638,7 +3373,7 @@
           <w:rFonts w:ascii="Verdana" w:hAnsi="Verdana"/>
           <w:b w:val="0"/>
           <w:bCs w:val="0"/>
-          <w:color w:val="943634" w:themeColor="accent2" w:themeShade="BF"/>
+          <w:color w:val="auto"/>
           <w:sz w:val="22"/>
           <w:szCs w:val="22"/>
         </w:rPr>
@@ -2649,7 +3384,7 @@
           <w:rFonts w:ascii="Verdana" w:hAnsi="Verdana"/>
           <w:b w:val="0"/>
           <w:bCs w:val="0"/>
-          <w:color w:val="943634" w:themeColor="accent2" w:themeShade="BF"/>
+          <w:color w:val="auto"/>
           <w:sz w:val="22"/>
           <w:szCs w:val="22"/>
           <w:lang w:val="es-EC"/>
@@ -2661,7 +3396,7 @@
           <w:rFonts w:ascii="Verdana" w:hAnsi="Verdana"/>
           <w:b w:val="0"/>
           <w:bCs w:val="0"/>
-          <w:color w:val="943634" w:themeColor="accent2" w:themeShade="BF"/>
+          <w:color w:val="auto"/>
           <w:sz w:val="22"/>
           <w:szCs w:val="22"/>
         </w:rPr>
@@ -2673,7 +3408,7 @@
           <w:b w:val="0"/>
           <w:bCs w:val="0"/>
           <w:noProof/>
-          <w:color w:val="943634" w:themeColor="accent2" w:themeShade="BF"/>
+          <w:color w:val="auto"/>
           <w:sz w:val="22"/>
           <w:szCs w:val="22"/>
           <w:lang w:val="es-EC"/>
@@ -2685,7 +3420,7 @@
           <w:rFonts w:ascii="Verdana" w:hAnsi="Verdana"/>
           <w:b w:val="0"/>
           <w:bCs w:val="0"/>
-          <w:color w:val="943634" w:themeColor="accent2" w:themeShade="BF"/>
+          <w:color w:val="auto"/>
           <w:sz w:val="22"/>
           <w:szCs w:val="22"/>
         </w:rPr>
@@ -2696,7 +3431,7 @@
           <w:rFonts w:ascii="Verdana" w:hAnsi="Verdana"/>
           <w:b w:val="0"/>
           <w:bCs w:val="0"/>
-          <w:color w:val="943634" w:themeColor="accent2" w:themeShade="BF"/>
+          <w:color w:val="auto"/>
           <w:sz w:val="22"/>
           <w:szCs w:val="22"/>
           <w:lang w:val="es-EC"/>
@@ -2762,18 +3497,19 @@
           <w:rFonts w:ascii="Verdana" w:hAnsi="Verdana"/>
           <w:b w:val="0"/>
           <w:bCs w:val="0"/>
-          <w:color w:val="943634" w:themeColor="accent2" w:themeShade="BF"/>
+          <w:color w:val="auto"/>
           <w:sz w:val="22"/>
           <w:szCs w:val="22"/>
           <w:lang w:val="es-EC"/>
         </w:rPr>
       </w:pPr>
+      <w:bookmarkStart w:id="8" w:name="_Toc240280838"/>
       <w:r>
         <w:rPr>
           <w:rFonts w:ascii="Verdana" w:hAnsi="Verdana"/>
           <w:b w:val="0"/>
           <w:bCs w:val="0"/>
-          <w:color w:val="943634" w:themeColor="accent2" w:themeShade="BF"/>
+          <w:color w:val="auto"/>
           <w:sz w:val="22"/>
           <w:szCs w:val="22"/>
           <w:lang w:val="es-EC"/>
@@ -2785,7 +3521,42 @@
           <w:rFonts w:ascii="Verdana" w:hAnsi="Verdana"/>
           <w:b w:val="0"/>
           <w:bCs w:val="0"/>
-          <w:color w:val="943634" w:themeColor="accent2" w:themeShade="BF"/>
+          <w:color w:val="auto"/>
+          <w:sz w:val="22"/>
+          <w:szCs w:val="22"/>
+        </w:rPr>
+        <w:fldChar w:fldCharType="begin"/>
+      </w:r>
+      <w:r>
+        <w:rPr>
+          <w:rFonts w:ascii="Verdana" w:hAnsi="Verdana"/>
+          <w:b w:val="0"/>
+          <w:bCs w:val="0"/>
+          <w:color w:val="auto"/>
+          <w:sz w:val="22"/>
+          <w:szCs w:val="22"/>
+          <w:lang w:val="es-EC"/>
+        </w:rPr>
+        <w:instrText xml:space="preserve"> SEQ Ilustración \* ARABIC </w:instrText>
+      </w:r>
+      <w:r>
+        <w:rPr>
+          <w:rFonts w:ascii="Verdana" w:hAnsi="Verdana"/>
+          <w:b w:val="0"/>
+          <w:bCs w:val="0"/>
+          <w:color w:val="auto"/>
+          <w:sz w:val="22"/>
+          <w:szCs w:val="22"/>
+        </w:rPr>
+        <w:fldChar w:fldCharType="separate"/>
+      </w:r>
+      <w:r>
+        <w:rPr>
+          <w:rFonts w:ascii="Verdana" w:hAnsi="Verdana"/>
+          <w:b w:val="0"/>
+          <w:bCs w:val="0"/>
+          <w:noProof/>
+          <w:color w:val="auto"/>
           <w:sz w:val="22"/>
           <w:szCs w:val="22"/>
           <w:lang w:val="es-EC"/>
@@ -2797,13 +3568,25 @@
           <w:rFonts w:ascii="Verdana" w:hAnsi="Verdana"/>
           <w:b w:val="0"/>
           <w:bCs w:val="0"/>
-          <w:color w:val="943634" w:themeColor="accent2" w:themeShade="BF"/>
+          <w:color w:val="auto"/>
+          <w:sz w:val="22"/>
+          <w:szCs w:val="22"/>
+        </w:rPr>
+        <w:fldChar w:fldCharType="end"/>
+      </w:r>
+      <w:r>
+        <w:rPr>
+          <w:rFonts w:ascii="Verdana" w:hAnsi="Verdana"/>
+          <w:b w:val="0"/>
+          <w:bCs w:val="0"/>
+          <w:color w:val="auto"/>
           <w:sz w:val="22"/>
           <w:szCs w:val="22"/>
           <w:lang w:val="es-EC"/>
         </w:rPr>
         <w:t xml:space="preserve"> Evidencia de Revisión JIRA</w:t>
       </w:r>
+      <w:bookmarkEnd w:id="8"/>
     </w:p>
     <w:p>
       <w:pPr>
@@ -2817,7 +3600,7 @@
           <w:lang w:val="es-EC"/>
         </w:rPr>
       </w:pPr>
-      <w:bookmarkStart w:id="8" w:name="_Toc239453340"/>
+      <w:bookmarkStart w:id="9" w:name="_Toc240279709"/>
       <w:r>
         <w:rPr>
           <w:rFonts w:ascii="Verdana" w:hAnsi="Verdana"/>
@@ -2828,7 +3611,7 @@
         </w:rPr>
         <w:t>EV-03 Revisión Sprint 2</w:t>
       </w:r>
-      <w:bookmarkEnd w:id="8"/>
+      <w:bookmarkEnd w:id="9"/>
     </w:p>
     <w:p>
       <w:pPr>
@@ -2899,19 +3682,19 @@
           <w:rFonts w:ascii="Verdana" w:hAnsi="Verdana"/>
           <w:b w:val="0"/>
           <w:bCs w:val="0"/>
-          <w:color w:val="000000" w:themeColor="text1"/>
+          <w:color w:val="auto"/>
           <w:sz w:val="22"/>
           <w:szCs w:val="22"/>
           <w:lang w:val="es-EC"/>
         </w:rPr>
       </w:pPr>
-      <w:bookmarkStart w:id="9" w:name="_Toc239453372"/>
+      <w:bookmarkStart w:id="10" w:name="_Toc240280839"/>
       <w:r>
         <w:rPr>
           <w:rFonts w:ascii="Verdana" w:hAnsi="Verdana"/>
           <w:b w:val="0"/>
           <w:bCs w:val="0"/>
-          <w:color w:val="000000" w:themeColor="text1"/>
+          <w:color w:val="auto"/>
           <w:sz w:val="22"/>
           <w:szCs w:val="22"/>
           <w:lang w:val="es-EC"/>
@@ -2923,7 +3706,7 @@
           <w:rFonts w:ascii="Verdana" w:hAnsi="Verdana"/>
           <w:b w:val="0"/>
           <w:bCs w:val="0"/>
-          <w:color w:val="000000" w:themeColor="text1"/>
+          <w:color w:val="auto"/>
           <w:sz w:val="22"/>
           <w:szCs w:val="22"/>
         </w:rPr>
@@ -2934,7 +3717,7 @@
           <w:rFonts w:ascii="Verdana" w:hAnsi="Verdana"/>
           <w:b w:val="0"/>
           <w:bCs w:val="0"/>
-          <w:color w:val="000000" w:themeColor="text1"/>
+          <w:color w:val="auto"/>
           <w:sz w:val="22"/>
           <w:szCs w:val="22"/>
           <w:lang w:val="es-EC"/>
@@ -2946,7 +3729,7 @@
           <w:rFonts w:ascii="Verdana" w:hAnsi="Verdana"/>
           <w:b w:val="0"/>
           <w:bCs w:val="0"/>
-          <w:color w:val="000000" w:themeColor="text1"/>
+          <w:color w:val="auto"/>
           <w:sz w:val="22"/>
           <w:szCs w:val="22"/>
         </w:rPr>
@@ -2958,19 +3741,19 @@
           <w:b w:val="0"/>
           <w:bCs w:val="0"/>
           <w:noProof/>
-          <w:color w:val="000000" w:themeColor="text1"/>
+          <w:color w:val="auto"/>
           <w:sz w:val="22"/>
           <w:szCs w:val="22"/>
           <w:lang w:val="es-EC"/>
         </w:rPr>
-        <w:t>6</w:t>
+        <w:t>7</w:t>
       </w:r>
       <w:r>
         <w:rPr>
           <w:rFonts w:ascii="Verdana" w:hAnsi="Verdana"/>
           <w:b w:val="0"/>
           <w:bCs w:val="0"/>
-          <w:color w:val="000000" w:themeColor="text1"/>
+          <w:color w:val="auto"/>
           <w:sz w:val="22"/>
           <w:szCs w:val="22"/>
         </w:rPr>
@@ -2981,14 +3764,14 @@
           <w:rFonts w:ascii="Verdana" w:hAnsi="Verdana"/>
           <w:b w:val="0"/>
           <w:bCs w:val="0"/>
-          <w:color w:val="000000" w:themeColor="text1"/>
+          <w:color w:val="auto"/>
           <w:sz w:val="22"/>
           <w:szCs w:val="22"/>
           <w:lang w:val="es-EC"/>
         </w:rPr>
         <w:t xml:space="preserve"> Evidencia de reunión planificación sprint 2</w:t>
       </w:r>
-      <w:bookmarkEnd w:id="9"/>
+      <w:bookmarkEnd w:id="10"/>
     </w:p>
     <w:p>
       <w:pPr>
@@ -3004,7 +3787,7 @@
         </w:rPr>
         <w:lastRenderedPageBreak/>
         <w:drawing>
-          <wp:inline distT="0" distB="0" distL="0" distR="0" wp14:anchorId="742720E1" wp14:editId="1C77A96B">
+          <wp:inline distT="0" distB="0" distL="0" distR="0" wp14:anchorId="00F31393" wp14:editId="0842B0A5">
             <wp:extent cx="5943600" cy="3138170"/>
             <wp:effectExtent l="0" t="0" r="0" b="5080"/>
             <wp:docPr id="334627438" name="Imagen 2"/>
@@ -3055,6 +3838,106 @@
     </w:p>
     <w:p>
       <w:pPr>
+        <w:pStyle w:val="Descripcin"/>
+        <w:jc w:val="center"/>
+        <w:rPr>
+          <w:rFonts w:ascii="Verdana" w:hAnsi="Verdana"/>
+          <w:b w:val="0"/>
+          <w:bCs w:val="0"/>
+          <w:color w:val="auto"/>
+          <w:sz w:val="22"/>
+          <w:szCs w:val="22"/>
+          <w:u w:val="single"/>
+          <w:lang w:val="es-EC"/>
+        </w:rPr>
+      </w:pPr>
+      <w:bookmarkStart w:id="11" w:name="_Toc240280840"/>
+      <w:r>
+        <w:rPr>
+          <w:rFonts w:ascii="Verdana" w:hAnsi="Verdana"/>
+          <w:b w:val="0"/>
+          <w:bCs w:val="0"/>
+          <w:color w:val="auto"/>
+          <w:sz w:val="22"/>
+          <w:szCs w:val="22"/>
+          <w:lang w:val="es-EC"/>
+        </w:rPr>
+        <w:t xml:space="preserve">Ilustración </w:t>
+      </w:r>
+      <w:r>
+        <w:rPr>
+          <w:rFonts w:ascii="Verdana" w:hAnsi="Verdana"/>
+          <w:b w:val="0"/>
+          <w:bCs w:val="0"/>
+          <w:color w:val="auto"/>
+          <w:sz w:val="22"/>
+          <w:szCs w:val="22"/>
+        </w:rPr>
+        <w:fldChar w:fldCharType="begin"/>
+      </w:r>
+      <w:r>
+        <w:rPr>
+          <w:rFonts w:ascii="Verdana" w:hAnsi="Verdana"/>
+          <w:b w:val="0"/>
+          <w:bCs w:val="0"/>
+          <w:color w:val="auto"/>
+          <w:sz w:val="22"/>
+          <w:szCs w:val="22"/>
+          <w:lang w:val="es-EC"/>
+        </w:rPr>
+        <w:instrText xml:space="preserve"> SEQ Ilustración \* ARABIC </w:instrText>
+      </w:r>
+      <w:r>
+        <w:rPr>
+          <w:rFonts w:ascii="Verdana" w:hAnsi="Verdana"/>
+          <w:b w:val="0"/>
+          <w:bCs w:val="0"/>
+          <w:color w:val="auto"/>
+          <w:sz w:val="22"/>
+          <w:szCs w:val="22"/>
+        </w:rPr>
+        <w:fldChar w:fldCharType="separate"/>
+      </w:r>
+      <w:r>
+        <w:rPr>
+          <w:rFonts w:ascii="Verdana" w:hAnsi="Verdana"/>
+          <w:b w:val="0"/>
+          <w:bCs w:val="0"/>
+          <w:noProof/>
+          <w:color w:val="auto"/>
+          <w:sz w:val="22"/>
+          <w:szCs w:val="22"/>
+          <w:lang w:val="es-EC"/>
+        </w:rPr>
+        <w:t>8</w:t>
+      </w:r>
+      <w:r>
+        <w:rPr>
+          <w:rFonts w:ascii="Verdana" w:hAnsi="Verdana"/>
+          <w:b w:val="0"/>
+          <w:bCs w:val="0"/>
+          <w:color w:val="auto"/>
+          <w:sz w:val="22"/>
+          <w:szCs w:val="22"/>
+        </w:rPr>
+        <w:fldChar w:fldCharType="end"/>
+      </w:r>
+      <w:r>
+        <w:rPr>
+          <w:rFonts w:ascii="Verdana" w:hAnsi="Verdana"/>
+          <w:b w:val="0"/>
+          <w:bCs w:val="0"/>
+          <w:color w:val="auto"/>
+          <w:sz w:val="22"/>
+          <w:szCs w:val="22"/>
+          <w:lang w:val="es-EC"/>
+        </w:rPr>
+        <w:t xml:space="preserve"> Estructura del repositorio GIT</w:t>
+      </w:r>
+      <w:bookmarkEnd w:id="11"/>
+    </w:p>
+    <w:p>
+      <w:pPr>
         <w:rPr>
           <w:lang w:val="es-EC"/>
         </w:rPr>
@@ -3065,7 +3948,7 @@
           <w:lang w:val="es-EC"/>
         </w:rPr>
         <w:drawing>
-          <wp:inline distT="0" distB="0" distL="0" distR="0" wp14:anchorId="3F42E630" wp14:editId="405FDC64">
+          <wp:inline distT="0" distB="0" distL="0" distR="0" wp14:anchorId="017F4CF0" wp14:editId="0BB74B80">
             <wp:extent cx="5943600" cy="3124200"/>
             <wp:effectExtent l="0" t="0" r="0" b="0"/>
             <wp:docPr id="1387078297" name="Imagen 3"/>
@@ -3116,6 +3999,105 @@
     </w:p>
     <w:p>
       <w:pPr>
+        <w:pStyle w:val="Descripcin"/>
+        <w:jc w:val="center"/>
+        <w:rPr>
+          <w:rFonts w:ascii="Verdana" w:hAnsi="Verdana"/>
+          <w:b w:val="0"/>
+          <w:bCs w:val="0"/>
+          <w:color w:val="auto"/>
+          <w:sz w:val="22"/>
+          <w:szCs w:val="22"/>
+          <w:lang w:val="es-EC"/>
+        </w:rPr>
+      </w:pPr>
+      <w:bookmarkStart w:id="12" w:name="_Toc240280841"/>
+      <w:r>
+        <w:rPr>
+          <w:rFonts w:ascii="Verdana" w:hAnsi="Verdana"/>
+          <w:b w:val="0"/>
+          <w:bCs w:val="0"/>
+          <w:color w:val="auto"/>
+          <w:sz w:val="22"/>
+          <w:szCs w:val="22"/>
+          <w:lang w:val="es-EC"/>
+        </w:rPr>
+        <w:t xml:space="preserve">Ilustración </w:t>
+      </w:r>
+      <w:r>
+        <w:rPr>
+          <w:rFonts w:ascii="Verdana" w:hAnsi="Verdana"/>
+          <w:b w:val="0"/>
+          <w:bCs w:val="0"/>
+          <w:color w:val="auto"/>
+          <w:sz w:val="22"/>
+          <w:szCs w:val="22"/>
+        </w:rPr>
+        <w:fldChar w:fldCharType="begin"/>
+      </w:r>
+      <w:r>
+        <w:rPr>
+          <w:rFonts w:ascii="Verdana" w:hAnsi="Verdana"/>
+          <w:b w:val="0"/>
+          <w:bCs w:val="0"/>
+          <w:color w:val="auto"/>
+          <w:sz w:val="22"/>
+          <w:szCs w:val="22"/>
+          <w:lang w:val="es-EC"/>
+        </w:rPr>
+        <w:instrText xml:space="preserve"> SEQ Ilustración \* ARABIC </w:instrText>
+      </w:r>
+      <w:r>
+        <w:rPr>
+          <w:rFonts w:ascii="Verdana" w:hAnsi="Verdana"/>
+          <w:b w:val="0"/>
+          <w:bCs w:val="0"/>
+          <w:color w:val="auto"/>
+          <w:sz w:val="22"/>
+          <w:szCs w:val="22"/>
+        </w:rPr>
+        <w:fldChar w:fldCharType="separate"/>
+      </w:r>
+      <w:r>
+        <w:rPr>
+          <w:rFonts w:ascii="Verdana" w:hAnsi="Verdana"/>
+          <w:b w:val="0"/>
+          <w:bCs w:val="0"/>
+          <w:noProof/>
+          <w:color w:val="auto"/>
+          <w:sz w:val="22"/>
+          <w:szCs w:val="22"/>
+          <w:lang w:val="es-EC"/>
+        </w:rPr>
+        <w:t>9</w:t>
+      </w:r>
+      <w:r>
+        <w:rPr>
+          <w:rFonts w:ascii="Verdana" w:hAnsi="Verdana"/>
+          <w:b w:val="0"/>
+          <w:bCs w:val="0"/>
+          <w:color w:val="auto"/>
+          <w:sz w:val="22"/>
+          <w:szCs w:val="22"/>
+        </w:rPr>
+        <w:fldChar w:fldCharType="end"/>
+      </w:r>
+      <w:r>
+        <w:rPr>
+          <w:rFonts w:ascii="Verdana" w:hAnsi="Verdana"/>
+          <w:b w:val="0"/>
+          <w:bCs w:val="0"/>
+          <w:color w:val="auto"/>
+          <w:sz w:val="22"/>
+          <w:szCs w:val="22"/>
+          <w:lang w:val="es-EC"/>
+        </w:rPr>
+        <w:t xml:space="preserve"> Estructura de ventanas wireframe</w:t>
+      </w:r>
+      <w:bookmarkEnd w:id="12"/>
+    </w:p>
+    <w:p>
+      <w:pPr>
         <w:rPr>
           <w:lang w:val="es-EC"/>
         </w:rPr>
@@ -3127,7 +4109,7 @@
         </w:rPr>
         <w:lastRenderedPageBreak/>
         <w:drawing>
-          <wp:inline distT="0" distB="0" distL="0" distR="0" wp14:anchorId="7D9648EB" wp14:editId="4F73D064">
+          <wp:inline distT="0" distB="0" distL="0" distR="0" wp14:anchorId="11D82118" wp14:editId="2B7A43CD">
             <wp:extent cx="5943600" cy="3131185"/>
             <wp:effectExtent l="0" t="0" r="0" b="0"/>
             <wp:docPr id="2128822706" name="Imagen 4"/>
@@ -3176,8 +4158,780 @@
         </w:drawing>
       </w:r>
     </w:p>
+    <w:p>
+      <w:pPr>
+        <w:pStyle w:val="Descripcin"/>
+        <w:jc w:val="center"/>
+        <w:rPr>
+          <w:rFonts w:ascii="Verdana" w:hAnsi="Verdana"/>
+          <w:b w:val="0"/>
+          <w:bCs w:val="0"/>
+          <w:color w:val="auto"/>
+          <w:sz w:val="22"/>
+          <w:szCs w:val="22"/>
+          <w:lang w:val="es-EC"/>
+        </w:rPr>
+      </w:pPr>
+      <w:bookmarkStart w:id="13" w:name="_Toc240280842"/>
+      <w:r>
+        <w:rPr>
+          <w:rFonts w:ascii="Verdana" w:hAnsi="Verdana"/>
+          <w:b w:val="0"/>
+          <w:bCs w:val="0"/>
+          <w:color w:val="auto"/>
+          <w:sz w:val="22"/>
+          <w:szCs w:val="22"/>
+          <w:lang w:val="es-EC"/>
+        </w:rPr>
+        <w:t xml:space="preserve">Ilustración </w:t>
+      </w:r>
+      <w:r>
+        <w:rPr>
+          <w:rFonts w:ascii="Verdana" w:hAnsi="Verdana"/>
+          <w:b w:val="0"/>
+          <w:bCs w:val="0"/>
+          <w:color w:val="auto"/>
+          <w:sz w:val="22"/>
+          <w:szCs w:val="22"/>
+        </w:rPr>
+        <w:fldChar w:fldCharType="begin"/>
+      </w:r>
+      <w:r>
+        <w:rPr>
+          <w:rFonts w:ascii="Verdana" w:hAnsi="Verdana"/>
+          <w:b w:val="0"/>
+          <w:bCs w:val="0"/>
+          <w:color w:val="auto"/>
+          <w:sz w:val="22"/>
+          <w:szCs w:val="22"/>
+          <w:lang w:val="es-EC"/>
+        </w:rPr>
+        <w:instrText xml:space="preserve"> SEQ Ilustración \* ARABIC </w:instrText>
+      </w:r>
+      <w:r>
+        <w:rPr>
+          <w:rFonts w:ascii="Verdana" w:hAnsi="Verdana"/>
+          <w:b w:val="0"/>
+          <w:bCs w:val="0"/>
+          <w:color w:val="auto"/>
+          <w:sz w:val="22"/>
+          <w:szCs w:val="22"/>
+        </w:rPr>
+        <w:fldChar w:fldCharType="separate"/>
+      </w:r>
+      <w:r>
+        <w:rPr>
+          <w:rFonts w:ascii="Verdana" w:hAnsi="Verdana"/>
+          <w:b w:val="0"/>
+          <w:bCs w:val="0"/>
+          <w:noProof/>
+          <w:color w:val="auto"/>
+          <w:sz w:val="22"/>
+          <w:szCs w:val="22"/>
+          <w:lang w:val="es-EC"/>
+        </w:rPr>
+        <w:t>10</w:t>
+      </w:r>
+      <w:r>
+        <w:rPr>
+          <w:rFonts w:ascii="Verdana" w:hAnsi="Verdana"/>
+          <w:b w:val="0"/>
+          <w:bCs w:val="0"/>
+          <w:color w:val="auto"/>
+          <w:sz w:val="22"/>
+          <w:szCs w:val="22"/>
+        </w:rPr>
+        <w:fldChar w:fldCharType="end"/>
+      </w:r>
+      <w:r>
+        <w:rPr>
+          <w:rFonts w:ascii="Verdana" w:hAnsi="Verdana"/>
+          <w:b w:val="0"/>
+          <w:bCs w:val="0"/>
+          <w:color w:val="auto"/>
+          <w:sz w:val="22"/>
+          <w:szCs w:val="22"/>
+          <w:lang w:val="es-EC"/>
+        </w:rPr>
+        <w:t xml:space="preserve"> Ev</w:t>
+      </w:r>
+      <w:r>
+        <w:rPr>
+          <w:rFonts w:ascii="Verdana" w:hAnsi="Verdana"/>
+          <w:b w:val="0"/>
+          <w:bCs w:val="0"/>
+          <w:color w:val="auto"/>
+          <w:sz w:val="22"/>
+          <w:szCs w:val="22"/>
+          <w:lang w:val="es-EC"/>
+        </w:rPr>
+        <w:t>idencia de</w:t>
+      </w:r>
+      <w:r>
+        <w:rPr>
+          <w:rFonts w:ascii="Verdana" w:hAnsi="Verdana"/>
+          <w:b w:val="0"/>
+          <w:bCs w:val="0"/>
+          <w:color w:val="auto"/>
+          <w:sz w:val="22"/>
+          <w:szCs w:val="22"/>
+          <w:lang w:val="es-EC"/>
+        </w:rPr>
+        <w:t xml:space="preserve"> </w:t>
+      </w:r>
+      <w:r>
+        <w:rPr>
+          <w:rFonts w:ascii="Verdana" w:hAnsi="Verdana"/>
+          <w:b w:val="0"/>
+          <w:bCs w:val="0"/>
+          <w:color w:val="auto"/>
+          <w:sz w:val="22"/>
+          <w:szCs w:val="22"/>
+          <w:lang w:val="es-EC"/>
+        </w:rPr>
+        <w:t>Revisión</w:t>
+      </w:r>
+      <w:r>
+        <w:rPr>
+          <w:rFonts w:ascii="Verdana" w:hAnsi="Verdana"/>
+          <w:b w:val="0"/>
+          <w:bCs w:val="0"/>
+          <w:color w:val="auto"/>
+          <w:sz w:val="22"/>
+          <w:szCs w:val="22"/>
+          <w:lang w:val="es-EC"/>
+        </w:rPr>
+        <w:t xml:space="preserve"> de wireframe</w:t>
+      </w:r>
+      <w:bookmarkEnd w:id="13"/>
+    </w:p>
+    <w:p>
+      <w:pPr>
+        <w:pStyle w:val="Ttulo1"/>
+        <w:spacing w:before="120" w:after="120"/>
+        <w:rPr>
+          <w:rFonts w:ascii="Verdana" w:hAnsi="Verdana"/>
+          <w:color w:val="943634" w:themeColor="accent2" w:themeShade="BF"/>
+          <w:sz w:val="32"/>
+          <w:szCs w:val="32"/>
+          <w:lang w:val="es-EC"/>
+        </w:rPr>
+      </w:pPr>
+      <w:bookmarkStart w:id="14" w:name="_Toc240279710"/>
+      <w:r>
+        <w:rPr>
+          <w:rFonts w:ascii="Verdana" w:hAnsi="Verdana"/>
+          <w:color w:val="943634" w:themeColor="accent2" w:themeShade="BF"/>
+          <w:sz w:val="32"/>
+          <w:szCs w:val="32"/>
+          <w:lang w:val="es-EC"/>
+        </w:rPr>
+        <w:t>EV-0</w:t>
+      </w:r>
+      <w:r>
+        <w:rPr>
+          <w:rFonts w:ascii="Verdana" w:hAnsi="Verdana"/>
+          <w:color w:val="943634" w:themeColor="accent2" w:themeShade="BF"/>
+          <w:sz w:val="32"/>
+          <w:szCs w:val="32"/>
+          <w:lang w:val="es-EC"/>
+        </w:rPr>
+        <w:t>4</w:t>
+      </w:r>
+      <w:r>
+        <w:rPr>
+          <w:rFonts w:ascii="Verdana" w:hAnsi="Verdana"/>
+          <w:color w:val="943634" w:themeColor="accent2" w:themeShade="BF"/>
+          <w:sz w:val="32"/>
+          <w:szCs w:val="32"/>
+          <w:lang w:val="es-EC"/>
+        </w:rPr>
+        <w:t xml:space="preserve"> Revisión Sprint </w:t>
+      </w:r>
+      <w:r>
+        <w:rPr>
+          <w:rFonts w:ascii="Verdana" w:hAnsi="Verdana"/>
+          <w:color w:val="943634" w:themeColor="accent2" w:themeShade="BF"/>
+          <w:sz w:val="32"/>
+          <w:szCs w:val="32"/>
+          <w:lang w:val="es-EC"/>
+        </w:rPr>
+        <w:t>3</w:t>
+      </w:r>
+      <w:bookmarkEnd w:id="14"/>
+    </w:p>
+    <w:p>
+      <w:pPr>
+        <w:rPr>
+          <w:lang w:val="es-EC"/>
+        </w:rPr>
+      </w:pPr>
+      <w:r>
+        <w:rPr>
+          <w:noProof/>
+          <w:lang w:val="es-EC"/>
+        </w:rPr>
+        <w:drawing>
+          <wp:inline distT="0" distB="0" distL="0" distR="0" wp14:anchorId="45C6D179" wp14:editId="17BA9B08">
+            <wp:extent cx="5943600" cy="3343275"/>
+            <wp:effectExtent l="0" t="0" r="0" b="9525"/>
+            <wp:docPr id="618553632" name="Imagen 1"/>
+            <wp:cNvGraphicFramePr>
+              <a:graphicFrameLocks xmlns:a="http://schemas.openxmlformats.org/drawingml/2006/main" noChangeAspect="1"/>
+            </wp:cNvGraphicFramePr>
+            <a:graphic xmlns:a="http://schemas.openxmlformats.org/drawingml/2006/main">
+              <a:graphicData uri="http://schemas.openxmlformats.org/drawingml/2006/picture">
+                <pic:pic xmlns:pic="http://schemas.openxmlformats.org/drawingml/2006/picture">
+                  <pic:nvPicPr>
+                    <pic:cNvPr id="618553632" name="Imagen 618553632"/>
+                    <pic:cNvPicPr/>
+                  </pic:nvPicPr>
+                  <pic:blipFill>
+                    <a:blip r:embed="rId19"/>
+                    <a:stretch>
+                      <a:fillRect/>
+                    </a:stretch>
+                  </pic:blipFill>
+                  <pic:spPr>
+                    <a:xfrm>
+                      <a:off x="0" y="0"/>
+                      <a:ext cx="5943600" cy="3343275"/>
+                    </a:xfrm>
+                    <a:prstGeom prst="rect">
+                      <a:avLst/>
+                    </a:prstGeom>
+                  </pic:spPr>
+                </pic:pic>
+              </a:graphicData>
+            </a:graphic>
+          </wp:inline>
+        </w:drawing>
+      </w:r>
+    </w:p>
+    <w:p>
+      <w:pPr>
+        <w:pStyle w:val="Descripcin"/>
+        <w:jc w:val="center"/>
+        <w:rPr>
+          <w:rFonts w:ascii="Verdana" w:hAnsi="Verdana"/>
+          <w:b w:val="0"/>
+          <w:bCs w:val="0"/>
+          <w:color w:val="auto"/>
+          <w:sz w:val="22"/>
+          <w:szCs w:val="22"/>
+          <w:lang w:val="es-EC"/>
+        </w:rPr>
+      </w:pPr>
+      <w:bookmarkStart w:id="15" w:name="_Toc240280843"/>
+      <w:r>
+        <w:rPr>
+          <w:rFonts w:ascii="Verdana" w:hAnsi="Verdana"/>
+          <w:b w:val="0"/>
+          <w:bCs w:val="0"/>
+          <w:color w:val="auto"/>
+          <w:sz w:val="22"/>
+          <w:szCs w:val="22"/>
+          <w:lang w:val="es-EC"/>
+        </w:rPr>
+        <w:t xml:space="preserve">Ilustración </w:t>
+      </w:r>
+      <w:r>
+        <w:rPr>
+          <w:rFonts w:ascii="Verdana" w:hAnsi="Verdana"/>
+          <w:b w:val="0"/>
+          <w:bCs w:val="0"/>
+          <w:color w:val="auto"/>
+          <w:sz w:val="22"/>
+          <w:szCs w:val="22"/>
+        </w:rPr>
+        <w:fldChar w:fldCharType="begin"/>
+      </w:r>
+      <w:r>
+        <w:rPr>
+          <w:rFonts w:ascii="Verdana" w:hAnsi="Verdana"/>
+          <w:b w:val="0"/>
+          <w:bCs w:val="0"/>
+          <w:color w:val="auto"/>
+          <w:sz w:val="22"/>
+          <w:szCs w:val="22"/>
+          <w:lang w:val="es-EC"/>
+        </w:rPr>
+        <w:instrText xml:space="preserve"> SEQ Ilustración \* ARABIC </w:instrText>
+      </w:r>
+      <w:r>
+        <w:rPr>
+          <w:rFonts w:ascii="Verdana" w:hAnsi="Verdana"/>
+          <w:b w:val="0"/>
+          <w:bCs w:val="0"/>
+          <w:color w:val="auto"/>
+          <w:sz w:val="22"/>
+          <w:szCs w:val="22"/>
+        </w:rPr>
+        <w:fldChar w:fldCharType="separate"/>
+      </w:r>
+      <w:r>
+        <w:rPr>
+          <w:rFonts w:ascii="Verdana" w:hAnsi="Verdana"/>
+          <w:b w:val="0"/>
+          <w:bCs w:val="0"/>
+          <w:noProof/>
+          <w:color w:val="auto"/>
+          <w:sz w:val="22"/>
+          <w:szCs w:val="22"/>
+          <w:lang w:val="es-EC"/>
+        </w:rPr>
+        <w:t>11</w:t>
+      </w:r>
+      <w:r>
+        <w:rPr>
+          <w:rFonts w:ascii="Verdana" w:hAnsi="Verdana"/>
+          <w:b w:val="0"/>
+          <w:bCs w:val="0"/>
+          <w:color w:val="auto"/>
+          <w:sz w:val="22"/>
+          <w:szCs w:val="22"/>
+        </w:rPr>
+        <w:fldChar w:fldCharType="end"/>
+      </w:r>
+      <w:r>
+        <w:rPr>
+          <w:rFonts w:ascii="Verdana" w:hAnsi="Verdana"/>
+          <w:b w:val="0"/>
+          <w:bCs w:val="0"/>
+          <w:color w:val="auto"/>
+          <w:sz w:val="22"/>
+          <w:szCs w:val="22"/>
+          <w:lang w:val="es-EC"/>
+        </w:rPr>
+        <w:t xml:space="preserve"> Evidencia de reunión planificación sprint 3</w:t>
+      </w:r>
+      <w:bookmarkEnd w:id="15"/>
+    </w:p>
+    <w:p>
+      <w:pPr>
+        <w:rPr>
+          <w:lang w:val="es-EC"/>
+        </w:rPr>
+      </w:pPr>
+    </w:p>
+    <w:p>
+      <w:pPr>
+        <w:rPr>
+          <w:lang w:val="es-EC"/>
+        </w:rPr>
+      </w:pPr>
+      <w:r>
+        <w:rPr>
+          <w:lang w:val="es-EC"/>
+        </w:rPr>
+        <w:lastRenderedPageBreak/>
+        <w:drawing>
+          <wp:inline distT="0" distB="0" distL="0" distR="0" wp14:anchorId="22A8516E" wp14:editId="71BEC0E2">
+            <wp:extent cx="5943600" cy="2075180"/>
+            <wp:effectExtent l="0" t="0" r="0" b="1270"/>
+            <wp:docPr id="1658309586" name="Imagen 1"/>
+            <wp:cNvGraphicFramePr>
+              <a:graphicFrameLocks xmlns:a="http://schemas.openxmlformats.org/drawingml/2006/main" noChangeAspect="1"/>
+            </wp:cNvGraphicFramePr>
+            <a:graphic xmlns:a="http://schemas.openxmlformats.org/drawingml/2006/main">
+              <a:graphicData uri="http://schemas.openxmlformats.org/drawingml/2006/picture">
+                <pic:pic xmlns:pic="http://schemas.openxmlformats.org/drawingml/2006/picture">
+                  <pic:nvPicPr>
+                    <pic:cNvPr id="1658309586" name=""/>
+                    <pic:cNvPicPr/>
+                  </pic:nvPicPr>
+                  <pic:blipFill>
+                    <a:blip r:embed="rId20"/>
+                    <a:stretch>
+                      <a:fillRect/>
+                    </a:stretch>
+                  </pic:blipFill>
+                  <pic:spPr>
+                    <a:xfrm>
+                      <a:off x="0" y="0"/>
+                      <a:ext cx="5943600" cy="2075180"/>
+                    </a:xfrm>
+                    <a:prstGeom prst="rect">
+                      <a:avLst/>
+                    </a:prstGeom>
+                  </pic:spPr>
+                </pic:pic>
+              </a:graphicData>
+            </a:graphic>
+          </wp:inline>
+        </w:drawing>
+      </w:r>
+    </w:p>
+    <w:p>
+      <w:pPr>
+        <w:pStyle w:val="Descripcin"/>
+        <w:jc w:val="center"/>
+        <w:rPr>
+          <w:rFonts w:ascii="Verdana" w:hAnsi="Verdana"/>
+          <w:b w:val="0"/>
+          <w:bCs w:val="0"/>
+          <w:color w:val="auto"/>
+          <w:sz w:val="22"/>
+          <w:szCs w:val="22"/>
+          <w:lang w:val="es-EC"/>
+        </w:rPr>
+      </w:pPr>
+      <w:bookmarkStart w:id="16" w:name="_Toc240280844"/>
+      <w:proofErr w:type="spellStart"/>
+      <w:r>
+        <w:rPr>
+          <w:rFonts w:ascii="Verdana" w:hAnsi="Verdana"/>
+          <w:b w:val="0"/>
+          <w:bCs w:val="0"/>
+          <w:color w:val="auto"/>
+          <w:sz w:val="22"/>
+          <w:szCs w:val="22"/>
+        </w:rPr>
+        <w:t>Ilustración</w:t>
+      </w:r>
+      <w:proofErr w:type="spellEnd"/>
+      <w:r>
+        <w:rPr>
+          <w:rFonts w:ascii="Verdana" w:hAnsi="Verdana"/>
+          <w:b w:val="0"/>
+          <w:bCs w:val="0"/>
+          <w:color w:val="auto"/>
+          <w:sz w:val="22"/>
+          <w:szCs w:val="22"/>
+        </w:rPr>
+        <w:t xml:space="preserve"> </w:t>
+      </w:r>
+      <w:r>
+        <w:rPr>
+          <w:rFonts w:ascii="Verdana" w:hAnsi="Verdana"/>
+          <w:b w:val="0"/>
+          <w:bCs w:val="0"/>
+          <w:color w:val="auto"/>
+          <w:sz w:val="22"/>
+          <w:szCs w:val="22"/>
+        </w:rPr>
+        <w:fldChar w:fldCharType="begin"/>
+      </w:r>
+      <w:r>
+        <w:rPr>
+          <w:rFonts w:ascii="Verdana" w:hAnsi="Verdana"/>
+          <w:b w:val="0"/>
+          <w:bCs w:val="0"/>
+          <w:color w:val="auto"/>
+          <w:sz w:val="22"/>
+          <w:szCs w:val="22"/>
+        </w:rPr>
+        <w:instrText xml:space="preserve"> SEQ Ilustración \* ARABIC </w:instrText>
+      </w:r>
+      <w:r>
+        <w:rPr>
+          <w:rFonts w:ascii="Verdana" w:hAnsi="Verdana"/>
+          <w:b w:val="0"/>
+          <w:bCs w:val="0"/>
+          <w:color w:val="auto"/>
+          <w:sz w:val="22"/>
+          <w:szCs w:val="22"/>
+        </w:rPr>
+        <w:fldChar w:fldCharType="separate"/>
+      </w:r>
+      <w:r>
+        <w:rPr>
+          <w:rFonts w:ascii="Verdana" w:hAnsi="Verdana"/>
+          <w:b w:val="0"/>
+          <w:bCs w:val="0"/>
+          <w:noProof/>
+          <w:color w:val="auto"/>
+          <w:sz w:val="22"/>
+          <w:szCs w:val="22"/>
+        </w:rPr>
+        <w:t>12</w:t>
+      </w:r>
+      <w:r>
+        <w:rPr>
+          <w:rFonts w:ascii="Verdana" w:hAnsi="Verdana"/>
+          <w:b w:val="0"/>
+          <w:bCs w:val="0"/>
+          <w:color w:val="auto"/>
+          <w:sz w:val="22"/>
+          <w:szCs w:val="22"/>
+        </w:rPr>
+        <w:fldChar w:fldCharType="end"/>
+      </w:r>
+      <w:r>
+        <w:rPr>
+          <w:rFonts w:ascii="Verdana" w:hAnsi="Verdana"/>
+          <w:b w:val="0"/>
+          <w:bCs w:val="0"/>
+          <w:color w:val="auto"/>
+          <w:sz w:val="22"/>
+          <w:szCs w:val="22"/>
+        </w:rPr>
+        <w:t xml:space="preserve"> </w:t>
+      </w:r>
+      <w:proofErr w:type="spellStart"/>
+      <w:r>
+        <w:rPr>
+          <w:rFonts w:ascii="Verdana" w:hAnsi="Verdana"/>
+          <w:b w:val="0"/>
+          <w:bCs w:val="0"/>
+          <w:color w:val="auto"/>
+          <w:sz w:val="22"/>
+          <w:szCs w:val="22"/>
+        </w:rPr>
+        <w:t>Evidencia</w:t>
+      </w:r>
+      <w:proofErr w:type="spellEnd"/>
+      <w:r>
+        <w:rPr>
+          <w:rFonts w:ascii="Verdana" w:hAnsi="Verdana"/>
+          <w:b w:val="0"/>
+          <w:bCs w:val="0"/>
+          <w:color w:val="auto"/>
+          <w:sz w:val="22"/>
+          <w:szCs w:val="22"/>
+        </w:rPr>
+        <w:t xml:space="preserve"> </w:t>
+      </w:r>
+      <w:proofErr w:type="spellStart"/>
+      <w:r>
+        <w:rPr>
+          <w:rFonts w:ascii="Verdana" w:hAnsi="Verdana"/>
+          <w:b w:val="0"/>
+          <w:bCs w:val="0"/>
+          <w:color w:val="auto"/>
+          <w:sz w:val="22"/>
+          <w:szCs w:val="22"/>
+        </w:rPr>
+        <w:t>Cronograma</w:t>
+      </w:r>
+      <w:proofErr w:type="spellEnd"/>
+      <w:r>
+        <w:rPr>
+          <w:rFonts w:ascii="Verdana" w:hAnsi="Verdana"/>
+          <w:b w:val="0"/>
+          <w:bCs w:val="0"/>
+          <w:color w:val="auto"/>
+          <w:sz w:val="22"/>
+          <w:szCs w:val="22"/>
+        </w:rPr>
+        <w:t xml:space="preserve">  </w:t>
+      </w:r>
+      <w:r>
+        <w:rPr>
+          <w:rFonts w:ascii="Verdana" w:hAnsi="Verdana"/>
+          <w:b w:val="0"/>
+          <w:bCs w:val="0"/>
+          <w:noProof/>
+          <w:color w:val="auto"/>
+          <w:sz w:val="22"/>
+          <w:szCs w:val="22"/>
+        </w:rPr>
+        <w:t>JIRA</w:t>
+      </w:r>
+      <w:bookmarkEnd w:id="16"/>
+    </w:p>
+    <w:p>
+      <w:pPr>
+        <w:rPr>
+          <w:lang w:val="es-EC"/>
+        </w:rPr>
+      </w:pPr>
+      <w:r>
+        <w:rPr>
+          <w:noProof/>
+          <w:lang w:val="es-EC"/>
+        </w:rPr>
+        <w:drawing>
+          <wp:inline distT="0" distB="0" distL="0" distR="0" wp14:anchorId="555CE4B9" wp14:editId="1C0E7B1F">
+            <wp:extent cx="5943600" cy="2157095"/>
+            <wp:effectExtent l="0" t="0" r="0" b="0"/>
+            <wp:docPr id="56743971" name="Imagen 3"/>
+            <wp:cNvGraphicFramePr>
+              <a:graphicFrameLocks xmlns:a="http://schemas.openxmlformats.org/drawingml/2006/main" noChangeAspect="1"/>
+            </wp:cNvGraphicFramePr>
+            <a:graphic xmlns:a="http://schemas.openxmlformats.org/drawingml/2006/main">
+              <a:graphicData uri="http://schemas.openxmlformats.org/drawingml/2006/picture">
+                <pic:pic xmlns:pic="http://schemas.openxmlformats.org/drawingml/2006/picture">
+                  <pic:nvPicPr>
+                    <pic:cNvPr id="56743971" name="Imagen 56743971"/>
+                    <pic:cNvPicPr/>
+                  </pic:nvPicPr>
+                  <pic:blipFill>
+                    <a:blip r:embed="rId21"/>
+                    <a:stretch>
+                      <a:fillRect/>
+                    </a:stretch>
+                  </pic:blipFill>
+                  <pic:spPr>
+                    <a:xfrm>
+                      <a:off x="0" y="0"/>
+                      <a:ext cx="5943600" cy="2157095"/>
+                    </a:xfrm>
+                    <a:prstGeom prst="rect">
+                      <a:avLst/>
+                    </a:prstGeom>
+                  </pic:spPr>
+                </pic:pic>
+              </a:graphicData>
+            </a:graphic>
+          </wp:inline>
+        </w:drawing>
+      </w:r>
+    </w:p>
+    <w:p>
+      <w:pPr>
+        <w:pStyle w:val="Descripcin"/>
+        <w:jc w:val="center"/>
+        <w:rPr>
+          <w:rFonts w:ascii="Verdana" w:hAnsi="Verdana"/>
+          <w:b w:val="0"/>
+          <w:bCs w:val="0"/>
+          <w:color w:val="auto"/>
+          <w:sz w:val="22"/>
+          <w:szCs w:val="22"/>
+          <w:lang w:val="es-EC"/>
+        </w:rPr>
+      </w:pPr>
+      <w:bookmarkStart w:id="17" w:name="_Toc240280845"/>
+      <w:proofErr w:type="spellStart"/>
+      <w:r>
+        <w:rPr>
+          <w:rFonts w:ascii="Verdana" w:hAnsi="Verdana"/>
+          <w:b w:val="0"/>
+          <w:bCs w:val="0"/>
+          <w:color w:val="auto"/>
+          <w:sz w:val="22"/>
+          <w:szCs w:val="22"/>
+        </w:rPr>
+        <w:t>Ilustración</w:t>
+      </w:r>
+      <w:proofErr w:type="spellEnd"/>
+      <w:r>
+        <w:rPr>
+          <w:rFonts w:ascii="Verdana" w:hAnsi="Verdana"/>
+          <w:b w:val="0"/>
+          <w:bCs w:val="0"/>
+          <w:color w:val="auto"/>
+          <w:sz w:val="22"/>
+          <w:szCs w:val="22"/>
+        </w:rPr>
+        <w:t xml:space="preserve"> </w:t>
+      </w:r>
+      <w:r>
+        <w:rPr>
+          <w:rFonts w:ascii="Verdana" w:hAnsi="Verdana"/>
+          <w:b w:val="0"/>
+          <w:bCs w:val="0"/>
+          <w:color w:val="auto"/>
+          <w:sz w:val="22"/>
+          <w:szCs w:val="22"/>
+        </w:rPr>
+        <w:fldChar w:fldCharType="begin"/>
+      </w:r>
+      <w:r>
+        <w:rPr>
+          <w:rFonts w:ascii="Verdana" w:hAnsi="Verdana"/>
+          <w:b w:val="0"/>
+          <w:bCs w:val="0"/>
+          <w:color w:val="auto"/>
+          <w:sz w:val="22"/>
+          <w:szCs w:val="22"/>
+        </w:rPr>
+        <w:instrText xml:space="preserve"> SEQ Ilustración \* ARABIC </w:instrText>
+      </w:r>
+      <w:r>
+        <w:rPr>
+          <w:rFonts w:ascii="Verdana" w:hAnsi="Verdana"/>
+          <w:b w:val="0"/>
+          <w:bCs w:val="0"/>
+          <w:color w:val="auto"/>
+          <w:sz w:val="22"/>
+          <w:szCs w:val="22"/>
+        </w:rPr>
+        <w:fldChar w:fldCharType="separate"/>
+      </w:r>
+      <w:r>
+        <w:rPr>
+          <w:rFonts w:ascii="Verdana" w:hAnsi="Verdana"/>
+          <w:b w:val="0"/>
+          <w:bCs w:val="0"/>
+          <w:noProof/>
+          <w:color w:val="auto"/>
+          <w:sz w:val="22"/>
+          <w:szCs w:val="22"/>
+        </w:rPr>
+        <w:t>13</w:t>
+      </w:r>
+      <w:r>
+        <w:rPr>
+          <w:rFonts w:ascii="Verdana" w:hAnsi="Verdana"/>
+          <w:b w:val="0"/>
+          <w:bCs w:val="0"/>
+          <w:color w:val="auto"/>
+          <w:sz w:val="22"/>
+          <w:szCs w:val="22"/>
+        </w:rPr>
+        <w:fldChar w:fldCharType="end"/>
+      </w:r>
+      <w:r>
+        <w:rPr>
+          <w:rFonts w:ascii="Verdana" w:hAnsi="Verdana"/>
+          <w:b w:val="0"/>
+          <w:bCs w:val="0"/>
+          <w:color w:val="auto"/>
+          <w:sz w:val="22"/>
+          <w:szCs w:val="22"/>
+        </w:rPr>
+        <w:t xml:space="preserve"> </w:t>
+      </w:r>
+      <w:proofErr w:type="spellStart"/>
+      <w:r>
+        <w:rPr>
+          <w:rFonts w:ascii="Verdana" w:hAnsi="Verdana"/>
+          <w:b w:val="0"/>
+          <w:bCs w:val="0"/>
+          <w:color w:val="auto"/>
+          <w:sz w:val="22"/>
+          <w:szCs w:val="22"/>
+        </w:rPr>
+        <w:t>Evidencia</w:t>
+      </w:r>
+      <w:proofErr w:type="spellEnd"/>
+      <w:r>
+        <w:rPr>
+          <w:rFonts w:ascii="Verdana" w:hAnsi="Verdana"/>
+          <w:b w:val="0"/>
+          <w:bCs w:val="0"/>
+          <w:color w:val="auto"/>
+          <w:sz w:val="22"/>
+          <w:szCs w:val="22"/>
+        </w:rPr>
+        <w:t xml:space="preserve"> </w:t>
+      </w:r>
+      <w:proofErr w:type="spellStart"/>
+      <w:r>
+        <w:rPr>
+          <w:rFonts w:ascii="Verdana" w:hAnsi="Verdana"/>
+          <w:b w:val="0"/>
+          <w:bCs w:val="0"/>
+          <w:color w:val="auto"/>
+          <w:sz w:val="22"/>
+          <w:szCs w:val="22"/>
+        </w:rPr>
+        <w:t>BPMn</w:t>
+      </w:r>
+      <w:bookmarkEnd w:id="17"/>
+      <w:proofErr w:type="spellEnd"/>
+    </w:p>
+    <w:p>
+      <w:pPr>
+        <w:rPr>
+          <w:lang w:val="es-EC"/>
+        </w:rPr>
+      </w:pPr>
+    </w:p>
     <w:sectPr>
-      <w:headerReference w:type="default" r:id="rId19"/>
+      <w:headerReference w:type="default" r:id="rId22"/>
       <w:pgSz w:w="12240" w:h="15840"/>
       <w:pgMar w:top="1440" w:right="1440" w:bottom="1440" w:left="1440" w:header="720" w:footer="720" w:gutter="0"/>
       <w:cols w:space="720"/>

</xml_diff>